<commit_message>
Changes to be committed:
</commit_message>
<xml_diff>
--- a/steam-2000!/PROYECTO_Steam_2000_Lenguaje_de_Marca.docx
+++ b/steam-2000!/PROYECTO_Steam_2000_Lenguaje_de_Marca.docx
@@ -246,6 +246,9 @@
     <w:p>
       <w:pPr>
         <w:jc w:val="center"/>
+        <w:rPr>
+          <w:rFonts w:eastAsia="Arial"/>
+        </w:rPr>
       </w:pPr>
       <w:proofErr w:type="spellStart"/>
       <w:r>
@@ -262,6 +265,2414 @@
         <w:t xml:space="preserve"> 2026</w:t>
       </w:r>
     </w:p>
+    <w:p>
+      <w:pPr>
+        <w:widowControl/>
+        <w:rPr>
+          <w:rFonts w:eastAsia="Arial"/>
+          <w:lang w:val="es-ES"/>
+        </w:rPr>
+      </w:pPr>
+      <w:r>
+        <w:rPr>
+          <w:rFonts w:eastAsia="Arial"/>
+        </w:rPr>
+        <w:br w:type="page"/>
+      </w:r>
+    </w:p>
+    <w:p>
+      <w:pPr>
+        <w:jc w:val="center"/>
+      </w:pPr>
+    </w:p>
+    <w:sdt>
+      <w:sdtPr>
+        <w:id w:val="-824586311"/>
+        <w:docPartObj>
+          <w:docPartGallery w:val="Table of Contents"/>
+          <w:docPartUnique/>
+        </w:docPartObj>
+      </w:sdtPr>
+      <w:sdtEndPr>
+        <w:rPr>
+          <w:rFonts w:ascii="Arial" w:eastAsiaTheme="minorEastAsia" w:hAnsi="Arial" w:cs="Arial"/>
+          <w:noProof/>
+          <w:color w:val="auto"/>
+          <w:sz w:val="22"/>
+          <w:szCs w:val="22"/>
+          <w:lang w:eastAsia="zh-CN"/>
+        </w:rPr>
+      </w:sdtEndPr>
+      <w:sdtContent>
+        <w:p>
+          <w:pPr>
+            <w:pStyle w:val="TOC"/>
+          </w:pPr>
+          <w:r>
+            <w:t xml:space="preserve">Índice </w:t>
+          </w:r>
+        </w:p>
+        <w:p>
+          <w:pPr>
+            <w:pStyle w:val="TOC1"/>
+            <w:tabs>
+              <w:tab w:val="right" w:leader="dot" w:pos="9016"/>
+            </w:tabs>
+            <w:rPr>
+              <w:rFonts w:asciiTheme="minorHAnsi" w:hAnsiTheme="minorHAnsi" w:cstheme="minorBidi"/>
+              <w:noProof/>
+              <w:kern w:val="2"/>
+              <w:szCs w:val="24"/>
+              <w14:ligatures w14:val="standardContextual"/>
+            </w:rPr>
+          </w:pPr>
+          <w:r>
+            <w:fldChar w:fldCharType="begin"/>
+          </w:r>
+          <w:r>
+            <w:instrText xml:space="preserve"> TOC \o "1-3" \h \z \u </w:instrText>
+          </w:r>
+          <w:r>
+            <w:fldChar w:fldCharType="separate"/>
+          </w:r>
+          <w:hyperlink w:anchor="_Toc225106731" w:history="1">
+            <w:r>
+              <w:rPr>
+                <w:rStyle w:val="a5"/>
+                <w:noProof/>
+              </w:rPr>
+              <w:t>Contenido</w:t>
+            </w:r>
+            <w:r>
+              <w:rPr>
+                <w:noProof/>
+                <w:webHidden/>
+              </w:rPr>
+              <w:tab/>
+            </w:r>
+            <w:r>
+              <w:rPr>
+                <w:noProof/>
+                <w:webHidden/>
+              </w:rPr>
+              <w:fldChar w:fldCharType="begin"/>
+            </w:r>
+            <w:r>
+              <w:rPr>
+                <w:noProof/>
+                <w:webHidden/>
+              </w:rPr>
+              <w:instrText xml:space="preserve"> PAGEREF _Toc225106731 \h </w:instrText>
+            </w:r>
+            <w:r>
+              <w:rPr>
+                <w:noProof/>
+                <w:webHidden/>
+              </w:rPr>
+            </w:r>
+            <w:r>
+              <w:rPr>
+                <w:noProof/>
+                <w:webHidden/>
+              </w:rPr>
+              <w:fldChar w:fldCharType="separate"/>
+            </w:r>
+            <w:r>
+              <w:rPr>
+                <w:noProof/>
+                <w:webHidden/>
+              </w:rPr>
+              <w:t>3</w:t>
+            </w:r>
+            <w:r>
+              <w:rPr>
+                <w:noProof/>
+                <w:webHidden/>
+              </w:rPr>
+              <w:fldChar w:fldCharType="end"/>
+            </w:r>
+          </w:hyperlink>
+        </w:p>
+        <w:p>
+          <w:pPr>
+            <w:pStyle w:val="TOC1"/>
+            <w:tabs>
+              <w:tab w:val="right" w:leader="dot" w:pos="9016"/>
+            </w:tabs>
+            <w:rPr>
+              <w:rFonts w:asciiTheme="minorHAnsi" w:hAnsiTheme="minorHAnsi" w:cstheme="minorBidi"/>
+              <w:noProof/>
+              <w:kern w:val="2"/>
+              <w:szCs w:val="24"/>
+              <w14:ligatures w14:val="standardContextual"/>
+            </w:rPr>
+          </w:pPr>
+          <w:hyperlink w:anchor="_Toc225106732" w:history="1">
+            <w:r>
+              <w:rPr>
+                <w:rStyle w:val="a5"/>
+                <w:noProof/>
+              </w:rPr>
+              <w:t>1. Introducción</w:t>
+            </w:r>
+            <w:r>
+              <w:rPr>
+                <w:noProof/>
+                <w:webHidden/>
+              </w:rPr>
+              <w:tab/>
+            </w:r>
+            <w:r>
+              <w:rPr>
+                <w:noProof/>
+                <w:webHidden/>
+              </w:rPr>
+              <w:fldChar w:fldCharType="begin"/>
+            </w:r>
+            <w:r>
+              <w:rPr>
+                <w:noProof/>
+                <w:webHidden/>
+              </w:rPr>
+              <w:instrText xml:space="preserve"> PAGEREF _Toc225106732 \h </w:instrText>
+            </w:r>
+            <w:r>
+              <w:rPr>
+                <w:noProof/>
+                <w:webHidden/>
+              </w:rPr>
+            </w:r>
+            <w:r>
+              <w:rPr>
+                <w:noProof/>
+                <w:webHidden/>
+              </w:rPr>
+              <w:fldChar w:fldCharType="separate"/>
+            </w:r>
+            <w:r>
+              <w:rPr>
+                <w:noProof/>
+                <w:webHidden/>
+              </w:rPr>
+              <w:t>4</w:t>
+            </w:r>
+            <w:r>
+              <w:rPr>
+                <w:noProof/>
+                <w:webHidden/>
+              </w:rPr>
+              <w:fldChar w:fldCharType="end"/>
+            </w:r>
+          </w:hyperlink>
+        </w:p>
+        <w:p>
+          <w:pPr>
+            <w:pStyle w:val="TOC1"/>
+            <w:tabs>
+              <w:tab w:val="right" w:leader="dot" w:pos="9016"/>
+            </w:tabs>
+            <w:rPr>
+              <w:rFonts w:asciiTheme="minorHAnsi" w:hAnsiTheme="minorHAnsi" w:cstheme="minorBidi"/>
+              <w:noProof/>
+              <w:kern w:val="2"/>
+              <w:szCs w:val="24"/>
+              <w14:ligatures w14:val="standardContextual"/>
+            </w:rPr>
+          </w:pPr>
+          <w:hyperlink w:anchor="_Toc225106733" w:history="1">
+            <w:r>
+              <w:rPr>
+                <w:rStyle w:val="a5"/>
+                <w:noProof/>
+              </w:rPr>
+              <w:t>2. Estructura del Proyecto</w:t>
+            </w:r>
+            <w:r>
+              <w:rPr>
+                <w:noProof/>
+                <w:webHidden/>
+              </w:rPr>
+              <w:tab/>
+            </w:r>
+            <w:r>
+              <w:rPr>
+                <w:noProof/>
+                <w:webHidden/>
+              </w:rPr>
+              <w:fldChar w:fldCharType="begin"/>
+            </w:r>
+            <w:r>
+              <w:rPr>
+                <w:noProof/>
+                <w:webHidden/>
+              </w:rPr>
+              <w:instrText xml:space="preserve"> PAGEREF _Toc225106733 \h </w:instrText>
+            </w:r>
+            <w:r>
+              <w:rPr>
+                <w:noProof/>
+                <w:webHidden/>
+              </w:rPr>
+            </w:r>
+            <w:r>
+              <w:rPr>
+                <w:noProof/>
+                <w:webHidden/>
+              </w:rPr>
+              <w:fldChar w:fldCharType="separate"/>
+            </w:r>
+            <w:r>
+              <w:rPr>
+                <w:noProof/>
+                <w:webHidden/>
+              </w:rPr>
+              <w:t>5</w:t>
+            </w:r>
+            <w:r>
+              <w:rPr>
+                <w:noProof/>
+                <w:webHidden/>
+              </w:rPr>
+              <w:fldChar w:fldCharType="end"/>
+            </w:r>
+          </w:hyperlink>
+        </w:p>
+        <w:p>
+          <w:pPr>
+            <w:pStyle w:val="TOC2"/>
+            <w:tabs>
+              <w:tab w:val="right" w:leader="dot" w:pos="9016"/>
+            </w:tabs>
+            <w:ind w:left="440"/>
+            <w:rPr>
+              <w:rFonts w:asciiTheme="minorHAnsi" w:hAnsiTheme="minorHAnsi" w:cstheme="minorBidi"/>
+              <w:noProof/>
+              <w:kern w:val="2"/>
+              <w:szCs w:val="24"/>
+              <w14:ligatures w14:val="standardContextual"/>
+            </w:rPr>
+          </w:pPr>
+          <w:hyperlink w:anchor="_Toc225106734" w:history="1">
+            <w:r>
+              <w:rPr>
+                <w:rStyle w:val="a5"/>
+                <w:noProof/>
+              </w:rPr>
+              <w:t>2.1 Archivos del proyecto</w:t>
+            </w:r>
+            <w:r>
+              <w:rPr>
+                <w:noProof/>
+                <w:webHidden/>
+              </w:rPr>
+              <w:tab/>
+            </w:r>
+            <w:r>
+              <w:rPr>
+                <w:noProof/>
+                <w:webHidden/>
+              </w:rPr>
+              <w:fldChar w:fldCharType="begin"/>
+            </w:r>
+            <w:r>
+              <w:rPr>
+                <w:noProof/>
+                <w:webHidden/>
+              </w:rPr>
+              <w:instrText xml:space="preserve"> PAGEREF _Toc225106734 \h </w:instrText>
+            </w:r>
+            <w:r>
+              <w:rPr>
+                <w:noProof/>
+                <w:webHidden/>
+              </w:rPr>
+            </w:r>
+            <w:r>
+              <w:rPr>
+                <w:noProof/>
+                <w:webHidden/>
+              </w:rPr>
+              <w:fldChar w:fldCharType="separate"/>
+            </w:r>
+            <w:r>
+              <w:rPr>
+                <w:noProof/>
+                <w:webHidden/>
+              </w:rPr>
+              <w:t>5</w:t>
+            </w:r>
+            <w:r>
+              <w:rPr>
+                <w:noProof/>
+                <w:webHidden/>
+              </w:rPr>
+              <w:fldChar w:fldCharType="end"/>
+            </w:r>
+          </w:hyperlink>
+        </w:p>
+        <w:p>
+          <w:pPr>
+            <w:pStyle w:val="TOC2"/>
+            <w:tabs>
+              <w:tab w:val="right" w:leader="dot" w:pos="9016"/>
+            </w:tabs>
+            <w:ind w:left="440"/>
+            <w:rPr>
+              <w:rFonts w:asciiTheme="minorHAnsi" w:hAnsiTheme="minorHAnsi" w:cstheme="minorBidi"/>
+              <w:noProof/>
+              <w:kern w:val="2"/>
+              <w:szCs w:val="24"/>
+              <w14:ligatures w14:val="standardContextual"/>
+            </w:rPr>
+          </w:pPr>
+          <w:hyperlink w:anchor="_Toc225106735" w:history="1">
+            <w:r>
+              <w:rPr>
+                <w:rStyle w:val="a5"/>
+                <w:noProof/>
+              </w:rPr>
+              <w:t>2.2 Páginas HTML</w:t>
+            </w:r>
+            <w:r>
+              <w:rPr>
+                <w:noProof/>
+                <w:webHidden/>
+              </w:rPr>
+              <w:tab/>
+            </w:r>
+            <w:r>
+              <w:rPr>
+                <w:noProof/>
+                <w:webHidden/>
+              </w:rPr>
+              <w:fldChar w:fldCharType="begin"/>
+            </w:r>
+            <w:r>
+              <w:rPr>
+                <w:noProof/>
+                <w:webHidden/>
+              </w:rPr>
+              <w:instrText xml:space="preserve"> PAGEREF _Toc225106735 \h </w:instrText>
+            </w:r>
+            <w:r>
+              <w:rPr>
+                <w:noProof/>
+                <w:webHidden/>
+              </w:rPr>
+            </w:r>
+            <w:r>
+              <w:rPr>
+                <w:noProof/>
+                <w:webHidden/>
+              </w:rPr>
+              <w:fldChar w:fldCharType="separate"/>
+            </w:r>
+            <w:r>
+              <w:rPr>
+                <w:noProof/>
+                <w:webHidden/>
+              </w:rPr>
+              <w:t>5</w:t>
+            </w:r>
+            <w:r>
+              <w:rPr>
+                <w:noProof/>
+                <w:webHidden/>
+              </w:rPr>
+              <w:fldChar w:fldCharType="end"/>
+            </w:r>
+          </w:hyperlink>
+        </w:p>
+        <w:p>
+          <w:pPr>
+            <w:pStyle w:val="TOC1"/>
+            <w:tabs>
+              <w:tab w:val="right" w:leader="dot" w:pos="9016"/>
+            </w:tabs>
+            <w:rPr>
+              <w:rFonts w:asciiTheme="minorHAnsi" w:hAnsiTheme="minorHAnsi" w:cstheme="minorBidi"/>
+              <w:noProof/>
+              <w:kern w:val="2"/>
+              <w:szCs w:val="24"/>
+              <w14:ligatures w14:val="standardContextual"/>
+            </w:rPr>
+          </w:pPr>
+          <w:hyperlink w:anchor="_Toc225106736" w:history="1">
+            <w:r>
+              <w:rPr>
+                <w:rStyle w:val="a5"/>
+                <w:noProof/>
+              </w:rPr>
+              <w:t>3. Estructura de Datos</w:t>
+            </w:r>
+            <w:r>
+              <w:rPr>
+                <w:noProof/>
+                <w:webHidden/>
+              </w:rPr>
+              <w:tab/>
+            </w:r>
+            <w:r>
+              <w:rPr>
+                <w:noProof/>
+                <w:webHidden/>
+              </w:rPr>
+              <w:fldChar w:fldCharType="begin"/>
+            </w:r>
+            <w:r>
+              <w:rPr>
+                <w:noProof/>
+                <w:webHidden/>
+              </w:rPr>
+              <w:instrText xml:space="preserve"> PAGEREF _Toc225106736 \h </w:instrText>
+            </w:r>
+            <w:r>
+              <w:rPr>
+                <w:noProof/>
+                <w:webHidden/>
+              </w:rPr>
+            </w:r>
+            <w:r>
+              <w:rPr>
+                <w:noProof/>
+                <w:webHidden/>
+              </w:rPr>
+              <w:fldChar w:fldCharType="separate"/>
+            </w:r>
+            <w:r>
+              <w:rPr>
+                <w:noProof/>
+                <w:webHidden/>
+              </w:rPr>
+              <w:t>6</w:t>
+            </w:r>
+            <w:r>
+              <w:rPr>
+                <w:noProof/>
+                <w:webHidden/>
+              </w:rPr>
+              <w:fldChar w:fldCharType="end"/>
+            </w:r>
+          </w:hyperlink>
+        </w:p>
+        <w:p>
+          <w:pPr>
+            <w:pStyle w:val="TOC2"/>
+            <w:tabs>
+              <w:tab w:val="right" w:leader="dot" w:pos="9016"/>
+            </w:tabs>
+            <w:ind w:left="440"/>
+            <w:rPr>
+              <w:rFonts w:asciiTheme="minorHAnsi" w:hAnsiTheme="minorHAnsi" w:cstheme="minorBidi"/>
+              <w:noProof/>
+              <w:kern w:val="2"/>
+              <w:szCs w:val="24"/>
+              <w14:ligatures w14:val="standardContextual"/>
+            </w:rPr>
+          </w:pPr>
+          <w:hyperlink w:anchor="_Toc225106737" w:history="1">
+            <w:r>
+              <w:rPr>
+                <w:rStyle w:val="a5"/>
+                <w:noProof/>
+              </w:rPr>
+              <w:t>3.1 Archivo JSON (games.json)</w:t>
+            </w:r>
+            <w:r>
+              <w:rPr>
+                <w:noProof/>
+                <w:webHidden/>
+              </w:rPr>
+              <w:tab/>
+            </w:r>
+            <w:r>
+              <w:rPr>
+                <w:noProof/>
+                <w:webHidden/>
+              </w:rPr>
+              <w:fldChar w:fldCharType="begin"/>
+            </w:r>
+            <w:r>
+              <w:rPr>
+                <w:noProof/>
+                <w:webHidden/>
+              </w:rPr>
+              <w:instrText xml:space="preserve"> PAGEREF _Toc225106737 \h </w:instrText>
+            </w:r>
+            <w:r>
+              <w:rPr>
+                <w:noProof/>
+                <w:webHidden/>
+              </w:rPr>
+            </w:r>
+            <w:r>
+              <w:rPr>
+                <w:noProof/>
+                <w:webHidden/>
+              </w:rPr>
+              <w:fldChar w:fldCharType="separate"/>
+            </w:r>
+            <w:r>
+              <w:rPr>
+                <w:noProof/>
+                <w:webHidden/>
+              </w:rPr>
+              <w:t>6</w:t>
+            </w:r>
+            <w:r>
+              <w:rPr>
+                <w:noProof/>
+                <w:webHidden/>
+              </w:rPr>
+              <w:fldChar w:fldCharType="end"/>
+            </w:r>
+          </w:hyperlink>
+        </w:p>
+        <w:p>
+          <w:pPr>
+            <w:pStyle w:val="TOC2"/>
+            <w:tabs>
+              <w:tab w:val="right" w:leader="dot" w:pos="9016"/>
+            </w:tabs>
+            <w:ind w:left="440"/>
+            <w:rPr>
+              <w:rFonts w:asciiTheme="minorHAnsi" w:hAnsiTheme="minorHAnsi" w:cstheme="minorBidi"/>
+              <w:noProof/>
+              <w:kern w:val="2"/>
+              <w:szCs w:val="24"/>
+              <w14:ligatures w14:val="standardContextual"/>
+            </w:rPr>
+          </w:pPr>
+          <w:hyperlink w:anchor="_Toc225106738" w:history="1">
+            <w:r>
+              <w:rPr>
+                <w:rStyle w:val="a5"/>
+                <w:noProof/>
+              </w:rPr>
+              <w:t>3.2 Archivo YAML (config.yaml)</w:t>
+            </w:r>
+            <w:r>
+              <w:rPr>
+                <w:noProof/>
+                <w:webHidden/>
+              </w:rPr>
+              <w:tab/>
+            </w:r>
+            <w:r>
+              <w:rPr>
+                <w:noProof/>
+                <w:webHidden/>
+              </w:rPr>
+              <w:fldChar w:fldCharType="begin"/>
+            </w:r>
+            <w:r>
+              <w:rPr>
+                <w:noProof/>
+                <w:webHidden/>
+              </w:rPr>
+              <w:instrText xml:space="preserve"> PAGEREF _Toc225106738 \h </w:instrText>
+            </w:r>
+            <w:r>
+              <w:rPr>
+                <w:noProof/>
+                <w:webHidden/>
+              </w:rPr>
+            </w:r>
+            <w:r>
+              <w:rPr>
+                <w:noProof/>
+                <w:webHidden/>
+              </w:rPr>
+              <w:fldChar w:fldCharType="separate"/>
+            </w:r>
+            <w:r>
+              <w:rPr>
+                <w:noProof/>
+                <w:webHidden/>
+              </w:rPr>
+              <w:t>6</w:t>
+            </w:r>
+            <w:r>
+              <w:rPr>
+                <w:noProof/>
+                <w:webHidden/>
+              </w:rPr>
+              <w:fldChar w:fldCharType="end"/>
+            </w:r>
+          </w:hyperlink>
+        </w:p>
+        <w:p>
+          <w:pPr>
+            <w:pStyle w:val="TOC1"/>
+            <w:tabs>
+              <w:tab w:val="right" w:leader="dot" w:pos="9016"/>
+            </w:tabs>
+            <w:rPr>
+              <w:rFonts w:asciiTheme="minorHAnsi" w:hAnsiTheme="minorHAnsi" w:cstheme="minorBidi"/>
+              <w:noProof/>
+              <w:kern w:val="2"/>
+              <w:szCs w:val="24"/>
+              <w14:ligatures w14:val="standardContextual"/>
+            </w:rPr>
+          </w:pPr>
+          <w:hyperlink w:anchor="_Toc225106739" w:history="1">
+            <w:r>
+              <w:rPr>
+                <w:rStyle w:val="a5"/>
+                <w:noProof/>
+              </w:rPr>
+              <w:t>4. Diseño con Bootstrap</w:t>
+            </w:r>
+            <w:r>
+              <w:rPr>
+                <w:noProof/>
+                <w:webHidden/>
+              </w:rPr>
+              <w:tab/>
+            </w:r>
+            <w:r>
+              <w:rPr>
+                <w:noProof/>
+                <w:webHidden/>
+              </w:rPr>
+              <w:fldChar w:fldCharType="begin"/>
+            </w:r>
+            <w:r>
+              <w:rPr>
+                <w:noProof/>
+                <w:webHidden/>
+              </w:rPr>
+              <w:instrText xml:space="preserve"> PAGEREF _Toc225106739 \h </w:instrText>
+            </w:r>
+            <w:r>
+              <w:rPr>
+                <w:noProof/>
+                <w:webHidden/>
+              </w:rPr>
+            </w:r>
+            <w:r>
+              <w:rPr>
+                <w:noProof/>
+                <w:webHidden/>
+              </w:rPr>
+              <w:fldChar w:fldCharType="separate"/>
+            </w:r>
+            <w:r>
+              <w:rPr>
+                <w:noProof/>
+                <w:webHidden/>
+              </w:rPr>
+              <w:t>7</w:t>
+            </w:r>
+            <w:r>
+              <w:rPr>
+                <w:noProof/>
+                <w:webHidden/>
+              </w:rPr>
+              <w:fldChar w:fldCharType="end"/>
+            </w:r>
+          </w:hyperlink>
+        </w:p>
+        <w:p>
+          <w:pPr>
+            <w:pStyle w:val="TOC2"/>
+            <w:tabs>
+              <w:tab w:val="right" w:leader="dot" w:pos="9016"/>
+            </w:tabs>
+            <w:ind w:left="440"/>
+            <w:rPr>
+              <w:rFonts w:asciiTheme="minorHAnsi" w:hAnsiTheme="minorHAnsi" w:cstheme="minorBidi"/>
+              <w:noProof/>
+              <w:kern w:val="2"/>
+              <w:szCs w:val="24"/>
+              <w14:ligatures w14:val="standardContextual"/>
+            </w:rPr>
+          </w:pPr>
+          <w:hyperlink w:anchor="_Toc225106740" w:history="1">
+            <w:r>
+              <w:rPr>
+                <w:rStyle w:val="a5"/>
+                <w:noProof/>
+              </w:rPr>
+              <w:t>4.1 Uso de Bootstrap 5</w:t>
+            </w:r>
+            <w:r>
+              <w:rPr>
+                <w:noProof/>
+                <w:webHidden/>
+              </w:rPr>
+              <w:tab/>
+            </w:r>
+            <w:r>
+              <w:rPr>
+                <w:noProof/>
+                <w:webHidden/>
+              </w:rPr>
+              <w:fldChar w:fldCharType="begin"/>
+            </w:r>
+            <w:r>
+              <w:rPr>
+                <w:noProof/>
+                <w:webHidden/>
+              </w:rPr>
+              <w:instrText xml:space="preserve"> PAGEREF _Toc225106740 \h </w:instrText>
+            </w:r>
+            <w:r>
+              <w:rPr>
+                <w:noProof/>
+                <w:webHidden/>
+              </w:rPr>
+            </w:r>
+            <w:r>
+              <w:rPr>
+                <w:noProof/>
+                <w:webHidden/>
+              </w:rPr>
+              <w:fldChar w:fldCharType="separate"/>
+            </w:r>
+            <w:r>
+              <w:rPr>
+                <w:noProof/>
+                <w:webHidden/>
+              </w:rPr>
+              <w:t>7</w:t>
+            </w:r>
+            <w:r>
+              <w:rPr>
+                <w:noProof/>
+                <w:webHidden/>
+              </w:rPr>
+              <w:fldChar w:fldCharType="end"/>
+            </w:r>
+          </w:hyperlink>
+        </w:p>
+        <w:p>
+          <w:pPr>
+            <w:pStyle w:val="TOC2"/>
+            <w:tabs>
+              <w:tab w:val="right" w:leader="dot" w:pos="9016"/>
+            </w:tabs>
+            <w:ind w:left="440"/>
+            <w:rPr>
+              <w:rFonts w:asciiTheme="minorHAnsi" w:hAnsiTheme="minorHAnsi" w:cstheme="minorBidi"/>
+              <w:noProof/>
+              <w:kern w:val="2"/>
+              <w:szCs w:val="24"/>
+              <w14:ligatures w14:val="standardContextual"/>
+            </w:rPr>
+          </w:pPr>
+          <w:hyperlink w:anchor="_Toc225106741" w:history="1">
+            <w:r>
+              <w:rPr>
+                <w:rStyle w:val="a5"/>
+                <w:noProof/>
+              </w:rPr>
+              <w:t>4.2 Estética retro Steam 2002</w:t>
+            </w:r>
+            <w:r>
+              <w:rPr>
+                <w:noProof/>
+                <w:webHidden/>
+              </w:rPr>
+              <w:tab/>
+            </w:r>
+            <w:r>
+              <w:rPr>
+                <w:noProof/>
+                <w:webHidden/>
+              </w:rPr>
+              <w:fldChar w:fldCharType="begin"/>
+            </w:r>
+            <w:r>
+              <w:rPr>
+                <w:noProof/>
+                <w:webHidden/>
+              </w:rPr>
+              <w:instrText xml:space="preserve"> PAGEREF _Toc225106741 \h </w:instrText>
+            </w:r>
+            <w:r>
+              <w:rPr>
+                <w:noProof/>
+                <w:webHidden/>
+              </w:rPr>
+            </w:r>
+            <w:r>
+              <w:rPr>
+                <w:noProof/>
+                <w:webHidden/>
+              </w:rPr>
+              <w:fldChar w:fldCharType="separate"/>
+            </w:r>
+            <w:r>
+              <w:rPr>
+                <w:noProof/>
+                <w:webHidden/>
+              </w:rPr>
+              <w:t>7</w:t>
+            </w:r>
+            <w:r>
+              <w:rPr>
+                <w:noProof/>
+                <w:webHidden/>
+              </w:rPr>
+              <w:fldChar w:fldCharType="end"/>
+            </w:r>
+          </w:hyperlink>
+        </w:p>
+        <w:p>
+          <w:pPr>
+            <w:pStyle w:val="TOC1"/>
+            <w:tabs>
+              <w:tab w:val="right" w:leader="dot" w:pos="9016"/>
+            </w:tabs>
+            <w:rPr>
+              <w:rFonts w:asciiTheme="minorHAnsi" w:hAnsiTheme="minorHAnsi" w:cstheme="minorBidi"/>
+              <w:noProof/>
+              <w:kern w:val="2"/>
+              <w:szCs w:val="24"/>
+              <w14:ligatures w14:val="standardContextual"/>
+            </w:rPr>
+          </w:pPr>
+          <w:hyperlink w:anchor="_Toc225106742" w:history="1">
+            <w:r>
+              <w:rPr>
+                <w:rStyle w:val="a5"/>
+                <w:noProof/>
+              </w:rPr>
+              <w:t>5. Interactividad</w:t>
+            </w:r>
+            <w:r>
+              <w:rPr>
+                <w:noProof/>
+                <w:webHidden/>
+              </w:rPr>
+              <w:tab/>
+            </w:r>
+            <w:r>
+              <w:rPr>
+                <w:noProof/>
+                <w:webHidden/>
+              </w:rPr>
+              <w:fldChar w:fldCharType="begin"/>
+            </w:r>
+            <w:r>
+              <w:rPr>
+                <w:noProof/>
+                <w:webHidden/>
+              </w:rPr>
+              <w:instrText xml:space="preserve"> PAGEREF _Toc225106742 \h </w:instrText>
+            </w:r>
+            <w:r>
+              <w:rPr>
+                <w:noProof/>
+                <w:webHidden/>
+              </w:rPr>
+            </w:r>
+            <w:r>
+              <w:rPr>
+                <w:noProof/>
+                <w:webHidden/>
+              </w:rPr>
+              <w:fldChar w:fldCharType="separate"/>
+            </w:r>
+            <w:r>
+              <w:rPr>
+                <w:noProof/>
+                <w:webHidden/>
+              </w:rPr>
+              <w:t>8</w:t>
+            </w:r>
+            <w:r>
+              <w:rPr>
+                <w:noProof/>
+                <w:webHidden/>
+              </w:rPr>
+              <w:fldChar w:fldCharType="end"/>
+            </w:r>
+          </w:hyperlink>
+        </w:p>
+        <w:p>
+          <w:pPr>
+            <w:pStyle w:val="TOC2"/>
+            <w:tabs>
+              <w:tab w:val="right" w:leader="dot" w:pos="9016"/>
+            </w:tabs>
+            <w:ind w:left="440"/>
+            <w:rPr>
+              <w:rFonts w:asciiTheme="minorHAnsi" w:hAnsiTheme="minorHAnsi" w:cstheme="minorBidi"/>
+              <w:noProof/>
+              <w:kern w:val="2"/>
+              <w:szCs w:val="24"/>
+              <w14:ligatures w14:val="standardContextual"/>
+            </w:rPr>
+          </w:pPr>
+          <w:hyperlink w:anchor="_Toc225106743" w:history="1">
+            <w:r>
+              <w:rPr>
+                <w:rStyle w:val="a5"/>
+                <w:noProof/>
+              </w:rPr>
+              <w:t>5.1 Filtrado por categoría</w:t>
+            </w:r>
+            <w:r>
+              <w:rPr>
+                <w:noProof/>
+                <w:webHidden/>
+              </w:rPr>
+              <w:tab/>
+            </w:r>
+            <w:r>
+              <w:rPr>
+                <w:noProof/>
+                <w:webHidden/>
+              </w:rPr>
+              <w:fldChar w:fldCharType="begin"/>
+            </w:r>
+            <w:r>
+              <w:rPr>
+                <w:noProof/>
+                <w:webHidden/>
+              </w:rPr>
+              <w:instrText xml:space="preserve"> PAGEREF _Toc225106743 \h </w:instrText>
+            </w:r>
+            <w:r>
+              <w:rPr>
+                <w:noProof/>
+                <w:webHidden/>
+              </w:rPr>
+            </w:r>
+            <w:r>
+              <w:rPr>
+                <w:noProof/>
+                <w:webHidden/>
+              </w:rPr>
+              <w:fldChar w:fldCharType="separate"/>
+            </w:r>
+            <w:r>
+              <w:rPr>
+                <w:noProof/>
+                <w:webHidden/>
+              </w:rPr>
+              <w:t>8</w:t>
+            </w:r>
+            <w:r>
+              <w:rPr>
+                <w:noProof/>
+                <w:webHidden/>
+              </w:rPr>
+              <w:fldChar w:fldCharType="end"/>
+            </w:r>
+          </w:hyperlink>
+        </w:p>
+        <w:p>
+          <w:pPr>
+            <w:pStyle w:val="TOC2"/>
+            <w:tabs>
+              <w:tab w:val="right" w:leader="dot" w:pos="9016"/>
+            </w:tabs>
+            <w:ind w:left="440"/>
+            <w:rPr>
+              <w:rFonts w:asciiTheme="minorHAnsi" w:hAnsiTheme="minorHAnsi" w:cstheme="minorBidi"/>
+              <w:noProof/>
+              <w:kern w:val="2"/>
+              <w:szCs w:val="24"/>
+              <w14:ligatures w14:val="standardContextual"/>
+            </w:rPr>
+          </w:pPr>
+          <w:hyperlink w:anchor="_Toc225106744" w:history="1">
+            <w:r>
+              <w:rPr>
+                <w:rStyle w:val="a5"/>
+                <w:noProof/>
+              </w:rPr>
+              <w:t>5.2 Vista cards y lista</w:t>
+            </w:r>
+            <w:r>
+              <w:rPr>
+                <w:noProof/>
+                <w:webHidden/>
+              </w:rPr>
+              <w:tab/>
+            </w:r>
+            <w:r>
+              <w:rPr>
+                <w:noProof/>
+                <w:webHidden/>
+              </w:rPr>
+              <w:fldChar w:fldCharType="begin"/>
+            </w:r>
+            <w:r>
+              <w:rPr>
+                <w:noProof/>
+                <w:webHidden/>
+              </w:rPr>
+              <w:instrText xml:space="preserve"> PAGEREF _Toc225106744 \h </w:instrText>
+            </w:r>
+            <w:r>
+              <w:rPr>
+                <w:noProof/>
+                <w:webHidden/>
+              </w:rPr>
+            </w:r>
+            <w:r>
+              <w:rPr>
+                <w:noProof/>
+                <w:webHidden/>
+              </w:rPr>
+              <w:fldChar w:fldCharType="separate"/>
+            </w:r>
+            <w:r>
+              <w:rPr>
+                <w:noProof/>
+                <w:webHidden/>
+              </w:rPr>
+              <w:t>8</w:t>
+            </w:r>
+            <w:r>
+              <w:rPr>
+                <w:noProof/>
+                <w:webHidden/>
+              </w:rPr>
+              <w:fldChar w:fldCharType="end"/>
+            </w:r>
+          </w:hyperlink>
+        </w:p>
+        <w:p>
+          <w:pPr>
+            <w:pStyle w:val="TOC2"/>
+            <w:tabs>
+              <w:tab w:val="right" w:leader="dot" w:pos="9016"/>
+            </w:tabs>
+            <w:ind w:left="440"/>
+            <w:rPr>
+              <w:rFonts w:asciiTheme="minorHAnsi" w:hAnsiTheme="minorHAnsi" w:cstheme="minorBidi"/>
+              <w:noProof/>
+              <w:kern w:val="2"/>
+              <w:szCs w:val="24"/>
+              <w14:ligatures w14:val="standardContextual"/>
+            </w:rPr>
+          </w:pPr>
+          <w:hyperlink w:anchor="_Toc225106745" w:history="1">
+            <w:r>
+              <w:rPr>
+                <w:rStyle w:val="a5"/>
+                <w:noProof/>
+              </w:rPr>
+              <w:t>5.3 Paginación</w:t>
+            </w:r>
+            <w:r>
+              <w:rPr>
+                <w:noProof/>
+                <w:webHidden/>
+              </w:rPr>
+              <w:tab/>
+            </w:r>
+            <w:r>
+              <w:rPr>
+                <w:noProof/>
+                <w:webHidden/>
+              </w:rPr>
+              <w:fldChar w:fldCharType="begin"/>
+            </w:r>
+            <w:r>
+              <w:rPr>
+                <w:noProof/>
+                <w:webHidden/>
+              </w:rPr>
+              <w:instrText xml:space="preserve"> PAGEREF _Toc225106745 \h </w:instrText>
+            </w:r>
+            <w:r>
+              <w:rPr>
+                <w:noProof/>
+                <w:webHidden/>
+              </w:rPr>
+            </w:r>
+            <w:r>
+              <w:rPr>
+                <w:noProof/>
+                <w:webHidden/>
+              </w:rPr>
+              <w:fldChar w:fldCharType="separate"/>
+            </w:r>
+            <w:r>
+              <w:rPr>
+                <w:noProof/>
+                <w:webHidden/>
+              </w:rPr>
+              <w:t>8</w:t>
+            </w:r>
+            <w:r>
+              <w:rPr>
+                <w:noProof/>
+                <w:webHidden/>
+              </w:rPr>
+              <w:fldChar w:fldCharType="end"/>
+            </w:r>
+          </w:hyperlink>
+        </w:p>
+        <w:p>
+          <w:pPr>
+            <w:pStyle w:val="TOC2"/>
+            <w:tabs>
+              <w:tab w:val="right" w:leader="dot" w:pos="9016"/>
+            </w:tabs>
+            <w:ind w:left="440"/>
+            <w:rPr>
+              <w:rFonts w:asciiTheme="minorHAnsi" w:hAnsiTheme="minorHAnsi" w:cstheme="minorBidi"/>
+              <w:noProof/>
+              <w:kern w:val="2"/>
+              <w:szCs w:val="24"/>
+              <w14:ligatures w14:val="standardContextual"/>
+            </w:rPr>
+          </w:pPr>
+          <w:hyperlink w:anchor="_Toc225106746" w:history="1">
+            <w:r>
+              <w:rPr>
+                <w:rStyle w:val="a5"/>
+                <w:noProof/>
+              </w:rPr>
+              <w:t>5.4 Configuración desde YAML</w:t>
+            </w:r>
+            <w:r>
+              <w:rPr>
+                <w:noProof/>
+                <w:webHidden/>
+              </w:rPr>
+              <w:tab/>
+            </w:r>
+            <w:r>
+              <w:rPr>
+                <w:noProof/>
+                <w:webHidden/>
+              </w:rPr>
+              <w:fldChar w:fldCharType="begin"/>
+            </w:r>
+            <w:r>
+              <w:rPr>
+                <w:noProof/>
+                <w:webHidden/>
+              </w:rPr>
+              <w:instrText xml:space="preserve"> PAGEREF _Toc225106746 \h </w:instrText>
+            </w:r>
+            <w:r>
+              <w:rPr>
+                <w:noProof/>
+                <w:webHidden/>
+              </w:rPr>
+            </w:r>
+            <w:r>
+              <w:rPr>
+                <w:noProof/>
+                <w:webHidden/>
+              </w:rPr>
+              <w:fldChar w:fldCharType="separate"/>
+            </w:r>
+            <w:r>
+              <w:rPr>
+                <w:noProof/>
+                <w:webHidden/>
+              </w:rPr>
+              <w:t>8</w:t>
+            </w:r>
+            <w:r>
+              <w:rPr>
+                <w:noProof/>
+                <w:webHidden/>
+              </w:rPr>
+              <w:fldChar w:fldCharType="end"/>
+            </w:r>
+          </w:hyperlink>
+        </w:p>
+        <w:p>
+          <w:pPr>
+            <w:pStyle w:val="TOC2"/>
+            <w:tabs>
+              <w:tab w:val="right" w:leader="dot" w:pos="9016"/>
+            </w:tabs>
+            <w:ind w:left="440"/>
+            <w:rPr>
+              <w:rFonts w:asciiTheme="minorHAnsi" w:hAnsiTheme="minorHAnsi" w:cstheme="minorBidi"/>
+              <w:noProof/>
+              <w:kern w:val="2"/>
+              <w:szCs w:val="24"/>
+              <w14:ligatures w14:val="standardContextual"/>
+            </w:rPr>
+          </w:pPr>
+          <w:hyperlink w:anchor="_Toc225106747" w:history="1">
+            <w:r>
+              <w:rPr>
+                <w:rStyle w:val="a5"/>
+                <w:noProof/>
+              </w:rPr>
+              <w:t>5.5 Tema oscuro y claro</w:t>
+            </w:r>
+            <w:r>
+              <w:rPr>
+                <w:noProof/>
+                <w:webHidden/>
+              </w:rPr>
+              <w:tab/>
+            </w:r>
+            <w:r>
+              <w:rPr>
+                <w:noProof/>
+                <w:webHidden/>
+              </w:rPr>
+              <w:fldChar w:fldCharType="begin"/>
+            </w:r>
+            <w:r>
+              <w:rPr>
+                <w:noProof/>
+                <w:webHidden/>
+              </w:rPr>
+              <w:instrText xml:space="preserve"> PAGEREF _Toc225106747 \h </w:instrText>
+            </w:r>
+            <w:r>
+              <w:rPr>
+                <w:noProof/>
+                <w:webHidden/>
+              </w:rPr>
+            </w:r>
+            <w:r>
+              <w:rPr>
+                <w:noProof/>
+                <w:webHidden/>
+              </w:rPr>
+              <w:fldChar w:fldCharType="separate"/>
+            </w:r>
+            <w:r>
+              <w:rPr>
+                <w:noProof/>
+                <w:webHidden/>
+              </w:rPr>
+              <w:t>8</w:t>
+            </w:r>
+            <w:r>
+              <w:rPr>
+                <w:noProof/>
+                <w:webHidden/>
+              </w:rPr>
+              <w:fldChar w:fldCharType="end"/>
+            </w:r>
+          </w:hyperlink>
+        </w:p>
+        <w:p>
+          <w:pPr>
+            <w:pStyle w:val="TOC2"/>
+            <w:tabs>
+              <w:tab w:val="right" w:leader="dot" w:pos="9016"/>
+            </w:tabs>
+            <w:ind w:left="440"/>
+            <w:rPr>
+              <w:rFonts w:asciiTheme="minorHAnsi" w:hAnsiTheme="minorHAnsi" w:cstheme="minorBidi"/>
+              <w:noProof/>
+              <w:kern w:val="2"/>
+              <w:szCs w:val="24"/>
+              <w14:ligatures w14:val="standardContextual"/>
+            </w:rPr>
+          </w:pPr>
+          <w:hyperlink w:anchor="_Toc225106748" w:history="1">
+            <w:r>
+              <w:rPr>
+                <w:rStyle w:val="a5"/>
+                <w:noProof/>
+              </w:rPr>
+              <w:t>5.6 Cambio de idioma</w:t>
+            </w:r>
+            <w:r>
+              <w:rPr>
+                <w:noProof/>
+                <w:webHidden/>
+              </w:rPr>
+              <w:tab/>
+            </w:r>
+            <w:r>
+              <w:rPr>
+                <w:noProof/>
+                <w:webHidden/>
+              </w:rPr>
+              <w:fldChar w:fldCharType="begin"/>
+            </w:r>
+            <w:r>
+              <w:rPr>
+                <w:noProof/>
+                <w:webHidden/>
+              </w:rPr>
+              <w:instrText xml:space="preserve"> PAGEREF _Toc225106748 \h </w:instrText>
+            </w:r>
+            <w:r>
+              <w:rPr>
+                <w:noProof/>
+                <w:webHidden/>
+              </w:rPr>
+            </w:r>
+            <w:r>
+              <w:rPr>
+                <w:noProof/>
+                <w:webHidden/>
+              </w:rPr>
+              <w:fldChar w:fldCharType="separate"/>
+            </w:r>
+            <w:r>
+              <w:rPr>
+                <w:noProof/>
+                <w:webHidden/>
+              </w:rPr>
+              <w:t>8</w:t>
+            </w:r>
+            <w:r>
+              <w:rPr>
+                <w:noProof/>
+                <w:webHidden/>
+              </w:rPr>
+              <w:fldChar w:fldCharType="end"/>
+            </w:r>
+          </w:hyperlink>
+        </w:p>
+        <w:p>
+          <w:pPr>
+            <w:pStyle w:val="TOC2"/>
+            <w:tabs>
+              <w:tab w:val="right" w:leader="dot" w:pos="9016"/>
+            </w:tabs>
+            <w:ind w:left="440"/>
+            <w:rPr>
+              <w:rFonts w:asciiTheme="minorHAnsi" w:hAnsiTheme="minorHAnsi" w:cstheme="minorBidi"/>
+              <w:noProof/>
+              <w:kern w:val="2"/>
+              <w:szCs w:val="24"/>
+              <w14:ligatures w14:val="standardContextual"/>
+            </w:rPr>
+          </w:pPr>
+          <w:hyperlink w:anchor="_Toc225106749" w:history="1">
+            <w:r>
+              <w:rPr>
+                <w:rStyle w:val="a5"/>
+                <w:noProof/>
+              </w:rPr>
+              <w:t>5.7 Inventario con localStorage</w:t>
+            </w:r>
+            <w:r>
+              <w:rPr>
+                <w:noProof/>
+                <w:webHidden/>
+              </w:rPr>
+              <w:tab/>
+            </w:r>
+            <w:r>
+              <w:rPr>
+                <w:noProof/>
+                <w:webHidden/>
+              </w:rPr>
+              <w:fldChar w:fldCharType="begin"/>
+            </w:r>
+            <w:r>
+              <w:rPr>
+                <w:noProof/>
+                <w:webHidden/>
+              </w:rPr>
+              <w:instrText xml:space="preserve"> PAGEREF _Toc225106749 \h </w:instrText>
+            </w:r>
+            <w:r>
+              <w:rPr>
+                <w:noProof/>
+                <w:webHidden/>
+              </w:rPr>
+            </w:r>
+            <w:r>
+              <w:rPr>
+                <w:noProof/>
+                <w:webHidden/>
+              </w:rPr>
+              <w:fldChar w:fldCharType="separate"/>
+            </w:r>
+            <w:r>
+              <w:rPr>
+                <w:noProof/>
+                <w:webHidden/>
+              </w:rPr>
+              <w:t>8</w:t>
+            </w:r>
+            <w:r>
+              <w:rPr>
+                <w:noProof/>
+                <w:webHidden/>
+              </w:rPr>
+              <w:fldChar w:fldCharType="end"/>
+            </w:r>
+          </w:hyperlink>
+        </w:p>
+        <w:p>
+          <w:pPr>
+            <w:pStyle w:val="TOC2"/>
+            <w:tabs>
+              <w:tab w:val="right" w:leader="dot" w:pos="9016"/>
+            </w:tabs>
+            <w:ind w:left="440"/>
+            <w:rPr>
+              <w:rFonts w:asciiTheme="minorHAnsi" w:hAnsiTheme="minorHAnsi" w:cstheme="minorBidi"/>
+              <w:noProof/>
+              <w:kern w:val="2"/>
+              <w:szCs w:val="24"/>
+              <w14:ligatures w14:val="standardContextual"/>
+            </w:rPr>
+          </w:pPr>
+          <w:hyperlink w:anchor="_Toc225106750" w:history="1">
+            <w:r>
+              <w:rPr>
+                <w:rStyle w:val="a5"/>
+                <w:noProof/>
+              </w:rPr>
+              <w:t>5.8 Login y registro</w:t>
+            </w:r>
+            <w:r>
+              <w:rPr>
+                <w:noProof/>
+                <w:webHidden/>
+              </w:rPr>
+              <w:tab/>
+            </w:r>
+            <w:r>
+              <w:rPr>
+                <w:noProof/>
+                <w:webHidden/>
+              </w:rPr>
+              <w:fldChar w:fldCharType="begin"/>
+            </w:r>
+            <w:r>
+              <w:rPr>
+                <w:noProof/>
+                <w:webHidden/>
+              </w:rPr>
+              <w:instrText xml:space="preserve"> PAGEREF _Toc225106750 \h </w:instrText>
+            </w:r>
+            <w:r>
+              <w:rPr>
+                <w:noProof/>
+                <w:webHidden/>
+              </w:rPr>
+            </w:r>
+            <w:r>
+              <w:rPr>
+                <w:noProof/>
+                <w:webHidden/>
+              </w:rPr>
+              <w:fldChar w:fldCharType="separate"/>
+            </w:r>
+            <w:r>
+              <w:rPr>
+                <w:noProof/>
+                <w:webHidden/>
+              </w:rPr>
+              <w:t>8</w:t>
+            </w:r>
+            <w:r>
+              <w:rPr>
+                <w:noProof/>
+                <w:webHidden/>
+              </w:rPr>
+              <w:fldChar w:fldCharType="end"/>
+            </w:r>
+          </w:hyperlink>
+        </w:p>
+        <w:p>
+          <w:pPr>
+            <w:pStyle w:val="TOC1"/>
+            <w:tabs>
+              <w:tab w:val="right" w:leader="dot" w:pos="9016"/>
+            </w:tabs>
+            <w:rPr>
+              <w:rFonts w:asciiTheme="minorHAnsi" w:hAnsiTheme="minorHAnsi" w:cstheme="minorBidi"/>
+              <w:noProof/>
+              <w:kern w:val="2"/>
+              <w:szCs w:val="24"/>
+              <w14:ligatures w14:val="standardContextual"/>
+            </w:rPr>
+          </w:pPr>
+          <w:hyperlink w:anchor="_Toc225106751" w:history="1">
+            <w:r>
+              <w:rPr>
+                <w:rStyle w:val="a5"/>
+                <w:noProof/>
+              </w:rPr>
+              <w:t>7. Memoria</w:t>
+            </w:r>
+            <w:r>
+              <w:rPr>
+                <w:noProof/>
+                <w:webHidden/>
+              </w:rPr>
+              <w:tab/>
+            </w:r>
+            <w:r>
+              <w:rPr>
+                <w:noProof/>
+                <w:webHidden/>
+              </w:rPr>
+              <w:fldChar w:fldCharType="begin"/>
+            </w:r>
+            <w:r>
+              <w:rPr>
+                <w:noProof/>
+                <w:webHidden/>
+              </w:rPr>
+              <w:instrText xml:space="preserve"> PAGEREF _Toc225106751 \h </w:instrText>
+            </w:r>
+            <w:r>
+              <w:rPr>
+                <w:noProof/>
+                <w:webHidden/>
+              </w:rPr>
+            </w:r>
+            <w:r>
+              <w:rPr>
+                <w:noProof/>
+                <w:webHidden/>
+              </w:rPr>
+              <w:fldChar w:fldCharType="separate"/>
+            </w:r>
+            <w:r>
+              <w:rPr>
+                <w:noProof/>
+                <w:webHidden/>
+              </w:rPr>
+              <w:t>10</w:t>
+            </w:r>
+            <w:r>
+              <w:rPr>
+                <w:noProof/>
+                <w:webHidden/>
+              </w:rPr>
+              <w:fldChar w:fldCharType="end"/>
+            </w:r>
+          </w:hyperlink>
+        </w:p>
+        <w:p>
+          <w:pPr>
+            <w:pStyle w:val="TOC2"/>
+            <w:tabs>
+              <w:tab w:val="right" w:leader="dot" w:pos="9016"/>
+            </w:tabs>
+            <w:ind w:left="440"/>
+            <w:rPr>
+              <w:rFonts w:asciiTheme="minorHAnsi" w:hAnsiTheme="minorHAnsi" w:cstheme="minorBidi"/>
+              <w:noProof/>
+              <w:kern w:val="2"/>
+              <w:szCs w:val="24"/>
+              <w14:ligatures w14:val="standardContextual"/>
+            </w:rPr>
+          </w:pPr>
+          <w:hyperlink w:anchor="_Toc225106752" w:history="1">
+            <w:r>
+              <w:rPr>
+                <w:rStyle w:val="a5"/>
+                <w:rFonts w:eastAsia="Arial"/>
+                <w:noProof/>
+              </w:rPr>
+              <w:t>1 Selección del tema</w:t>
+            </w:r>
+            <w:r>
+              <w:rPr>
+                <w:noProof/>
+                <w:webHidden/>
+              </w:rPr>
+              <w:tab/>
+            </w:r>
+            <w:r>
+              <w:rPr>
+                <w:noProof/>
+                <w:webHidden/>
+              </w:rPr>
+              <w:fldChar w:fldCharType="begin"/>
+            </w:r>
+            <w:r>
+              <w:rPr>
+                <w:noProof/>
+                <w:webHidden/>
+              </w:rPr>
+              <w:instrText xml:space="preserve"> PAGEREF _Toc225106752 \h </w:instrText>
+            </w:r>
+            <w:r>
+              <w:rPr>
+                <w:noProof/>
+                <w:webHidden/>
+              </w:rPr>
+            </w:r>
+            <w:r>
+              <w:rPr>
+                <w:noProof/>
+                <w:webHidden/>
+              </w:rPr>
+              <w:fldChar w:fldCharType="separate"/>
+            </w:r>
+            <w:r>
+              <w:rPr>
+                <w:noProof/>
+                <w:webHidden/>
+              </w:rPr>
+              <w:t>10</w:t>
+            </w:r>
+            <w:r>
+              <w:rPr>
+                <w:noProof/>
+                <w:webHidden/>
+              </w:rPr>
+              <w:fldChar w:fldCharType="end"/>
+            </w:r>
+          </w:hyperlink>
+        </w:p>
+        <w:p>
+          <w:pPr>
+            <w:pStyle w:val="TOC2"/>
+            <w:tabs>
+              <w:tab w:val="right" w:leader="dot" w:pos="9016"/>
+            </w:tabs>
+            <w:ind w:left="440"/>
+            <w:rPr>
+              <w:rFonts w:asciiTheme="minorHAnsi" w:hAnsiTheme="minorHAnsi" w:cstheme="minorBidi"/>
+              <w:noProof/>
+              <w:kern w:val="2"/>
+              <w:szCs w:val="24"/>
+              <w14:ligatures w14:val="standardContextual"/>
+            </w:rPr>
+          </w:pPr>
+          <w:hyperlink w:anchor="_Toc225106753" w:history="1">
+            <w:r>
+              <w:rPr>
+                <w:rStyle w:val="a5"/>
+                <w:rFonts w:eastAsia="Arial"/>
+                <w:noProof/>
+              </w:rPr>
+              <w:t>2 División de roles</w:t>
+            </w:r>
+            <w:r>
+              <w:rPr>
+                <w:noProof/>
+                <w:webHidden/>
+              </w:rPr>
+              <w:tab/>
+            </w:r>
+            <w:r>
+              <w:rPr>
+                <w:noProof/>
+                <w:webHidden/>
+              </w:rPr>
+              <w:fldChar w:fldCharType="begin"/>
+            </w:r>
+            <w:r>
+              <w:rPr>
+                <w:noProof/>
+                <w:webHidden/>
+              </w:rPr>
+              <w:instrText xml:space="preserve"> PAGEREF _Toc225106753 \h </w:instrText>
+            </w:r>
+            <w:r>
+              <w:rPr>
+                <w:noProof/>
+                <w:webHidden/>
+              </w:rPr>
+            </w:r>
+            <w:r>
+              <w:rPr>
+                <w:noProof/>
+                <w:webHidden/>
+              </w:rPr>
+              <w:fldChar w:fldCharType="separate"/>
+            </w:r>
+            <w:r>
+              <w:rPr>
+                <w:noProof/>
+                <w:webHidden/>
+              </w:rPr>
+              <w:t>10</w:t>
+            </w:r>
+            <w:r>
+              <w:rPr>
+                <w:noProof/>
+                <w:webHidden/>
+              </w:rPr>
+              <w:fldChar w:fldCharType="end"/>
+            </w:r>
+          </w:hyperlink>
+        </w:p>
+        <w:p>
+          <w:pPr>
+            <w:pStyle w:val="TOC2"/>
+            <w:tabs>
+              <w:tab w:val="right" w:leader="dot" w:pos="9016"/>
+            </w:tabs>
+            <w:ind w:left="440"/>
+            <w:rPr>
+              <w:rFonts w:asciiTheme="minorHAnsi" w:hAnsiTheme="minorHAnsi" w:cstheme="minorBidi"/>
+              <w:noProof/>
+              <w:kern w:val="2"/>
+              <w:szCs w:val="24"/>
+              <w14:ligatures w14:val="standardContextual"/>
+            </w:rPr>
+          </w:pPr>
+          <w:hyperlink w:anchor="_Toc225106754" w:history="1">
+            <w:r>
+              <w:rPr>
+                <w:rStyle w:val="a5"/>
+                <w:rFonts w:eastAsia="Arial"/>
+                <w:noProof/>
+              </w:rPr>
+              <w:t>3 Planificación semanal</w:t>
+            </w:r>
+            <w:r>
+              <w:rPr>
+                <w:noProof/>
+                <w:webHidden/>
+              </w:rPr>
+              <w:tab/>
+            </w:r>
+            <w:r>
+              <w:rPr>
+                <w:noProof/>
+                <w:webHidden/>
+              </w:rPr>
+              <w:fldChar w:fldCharType="begin"/>
+            </w:r>
+            <w:r>
+              <w:rPr>
+                <w:noProof/>
+                <w:webHidden/>
+              </w:rPr>
+              <w:instrText xml:space="preserve"> PAGEREF _Toc225106754 \h </w:instrText>
+            </w:r>
+            <w:r>
+              <w:rPr>
+                <w:noProof/>
+                <w:webHidden/>
+              </w:rPr>
+            </w:r>
+            <w:r>
+              <w:rPr>
+                <w:noProof/>
+                <w:webHidden/>
+              </w:rPr>
+              <w:fldChar w:fldCharType="separate"/>
+            </w:r>
+            <w:r>
+              <w:rPr>
+                <w:noProof/>
+                <w:webHidden/>
+              </w:rPr>
+              <w:t>10</w:t>
+            </w:r>
+            <w:r>
+              <w:rPr>
+                <w:noProof/>
+                <w:webHidden/>
+              </w:rPr>
+              <w:fldChar w:fldCharType="end"/>
+            </w:r>
+          </w:hyperlink>
+        </w:p>
+        <w:p>
+          <w:pPr>
+            <w:pStyle w:val="TOC2"/>
+            <w:tabs>
+              <w:tab w:val="right" w:leader="dot" w:pos="9016"/>
+            </w:tabs>
+            <w:ind w:left="440"/>
+            <w:rPr>
+              <w:rFonts w:asciiTheme="minorHAnsi" w:hAnsiTheme="minorHAnsi" w:cstheme="minorBidi"/>
+              <w:noProof/>
+              <w:kern w:val="2"/>
+              <w:szCs w:val="24"/>
+              <w14:ligatures w14:val="standardContextual"/>
+            </w:rPr>
+          </w:pPr>
+          <w:hyperlink w:anchor="_Toc225106755" w:history="1">
+            <w:r>
+              <w:rPr>
+                <w:rStyle w:val="a5"/>
+                <w:rFonts w:eastAsia="Arial"/>
+                <w:noProof/>
+              </w:rPr>
+              <w:t>4. Desarrollo día a día</w:t>
+            </w:r>
+            <w:r>
+              <w:rPr>
+                <w:noProof/>
+                <w:webHidden/>
+              </w:rPr>
+              <w:tab/>
+            </w:r>
+            <w:r>
+              <w:rPr>
+                <w:noProof/>
+                <w:webHidden/>
+              </w:rPr>
+              <w:fldChar w:fldCharType="begin"/>
+            </w:r>
+            <w:r>
+              <w:rPr>
+                <w:noProof/>
+                <w:webHidden/>
+              </w:rPr>
+              <w:instrText xml:space="preserve"> PAGEREF _Toc225106755 \h </w:instrText>
+            </w:r>
+            <w:r>
+              <w:rPr>
+                <w:noProof/>
+                <w:webHidden/>
+              </w:rPr>
+            </w:r>
+            <w:r>
+              <w:rPr>
+                <w:noProof/>
+                <w:webHidden/>
+              </w:rPr>
+              <w:fldChar w:fldCharType="separate"/>
+            </w:r>
+            <w:r>
+              <w:rPr>
+                <w:noProof/>
+                <w:webHidden/>
+              </w:rPr>
+              <w:t>11</w:t>
+            </w:r>
+            <w:r>
+              <w:rPr>
+                <w:noProof/>
+                <w:webHidden/>
+              </w:rPr>
+              <w:fldChar w:fldCharType="end"/>
+            </w:r>
+          </w:hyperlink>
+        </w:p>
+        <w:p>
+          <w:pPr>
+            <w:pStyle w:val="TOC2"/>
+            <w:tabs>
+              <w:tab w:val="right" w:leader="dot" w:pos="9016"/>
+            </w:tabs>
+            <w:ind w:leftChars="300" w:left="660"/>
+            <w:rPr>
+              <w:rFonts w:asciiTheme="minorHAnsi" w:hAnsiTheme="minorHAnsi" w:cstheme="minorBidi"/>
+              <w:noProof/>
+              <w:kern w:val="2"/>
+              <w:szCs w:val="24"/>
+              <w14:ligatures w14:val="standardContextual"/>
+            </w:rPr>
+          </w:pPr>
+          <w:hyperlink w:anchor="_Toc225106756" w:history="1">
+            <w:r>
+              <w:rPr>
+                <w:rStyle w:val="a5"/>
+                <w:rFonts w:eastAsia="Arial"/>
+                <w:noProof/>
+              </w:rPr>
+              <w:t>4.1 Lunes 16 — Estructura y datos</w:t>
+            </w:r>
+            <w:r>
+              <w:rPr>
+                <w:noProof/>
+                <w:webHidden/>
+              </w:rPr>
+              <w:tab/>
+            </w:r>
+            <w:r>
+              <w:rPr>
+                <w:noProof/>
+                <w:webHidden/>
+              </w:rPr>
+              <w:fldChar w:fldCharType="begin"/>
+            </w:r>
+            <w:r>
+              <w:rPr>
+                <w:noProof/>
+                <w:webHidden/>
+              </w:rPr>
+              <w:instrText xml:space="preserve"> PAGEREF _Toc225106756 \h </w:instrText>
+            </w:r>
+            <w:r>
+              <w:rPr>
+                <w:noProof/>
+                <w:webHidden/>
+              </w:rPr>
+            </w:r>
+            <w:r>
+              <w:rPr>
+                <w:noProof/>
+                <w:webHidden/>
+              </w:rPr>
+              <w:fldChar w:fldCharType="separate"/>
+            </w:r>
+            <w:r>
+              <w:rPr>
+                <w:noProof/>
+                <w:webHidden/>
+              </w:rPr>
+              <w:t>11</w:t>
+            </w:r>
+            <w:r>
+              <w:rPr>
+                <w:noProof/>
+                <w:webHidden/>
+              </w:rPr>
+              <w:fldChar w:fldCharType="end"/>
+            </w:r>
+          </w:hyperlink>
+        </w:p>
+        <w:p>
+          <w:pPr>
+            <w:pStyle w:val="TOC2"/>
+            <w:tabs>
+              <w:tab w:val="right" w:leader="dot" w:pos="9016"/>
+            </w:tabs>
+            <w:ind w:leftChars="300" w:left="660"/>
+            <w:rPr>
+              <w:rFonts w:asciiTheme="minorHAnsi" w:hAnsiTheme="minorHAnsi" w:cstheme="minorBidi"/>
+              <w:noProof/>
+              <w:kern w:val="2"/>
+              <w:szCs w:val="24"/>
+              <w14:ligatures w14:val="standardContextual"/>
+            </w:rPr>
+          </w:pPr>
+          <w:hyperlink w:anchor="_Toc225106757" w:history="1">
+            <w:r>
+              <w:rPr>
+                <w:rStyle w:val="a5"/>
+                <w:rFonts w:eastAsia="Arial"/>
+                <w:noProof/>
+              </w:rPr>
+              <w:t>4.2 Martes 17 — Diseño inicial SPA</w:t>
+            </w:r>
+            <w:r>
+              <w:rPr>
+                <w:noProof/>
+                <w:webHidden/>
+              </w:rPr>
+              <w:tab/>
+            </w:r>
+            <w:r>
+              <w:rPr>
+                <w:noProof/>
+                <w:webHidden/>
+              </w:rPr>
+              <w:fldChar w:fldCharType="begin"/>
+            </w:r>
+            <w:r>
+              <w:rPr>
+                <w:noProof/>
+                <w:webHidden/>
+              </w:rPr>
+              <w:instrText xml:space="preserve"> PAGEREF _Toc225106757 \h </w:instrText>
+            </w:r>
+            <w:r>
+              <w:rPr>
+                <w:noProof/>
+                <w:webHidden/>
+              </w:rPr>
+            </w:r>
+            <w:r>
+              <w:rPr>
+                <w:noProof/>
+                <w:webHidden/>
+              </w:rPr>
+              <w:fldChar w:fldCharType="separate"/>
+            </w:r>
+            <w:r>
+              <w:rPr>
+                <w:noProof/>
+                <w:webHidden/>
+              </w:rPr>
+              <w:t>11</w:t>
+            </w:r>
+            <w:r>
+              <w:rPr>
+                <w:noProof/>
+                <w:webHidden/>
+              </w:rPr>
+              <w:fldChar w:fldCharType="end"/>
+            </w:r>
+          </w:hyperlink>
+        </w:p>
+        <w:p>
+          <w:pPr>
+            <w:pStyle w:val="TOC2"/>
+            <w:tabs>
+              <w:tab w:val="right" w:leader="dot" w:pos="9016"/>
+            </w:tabs>
+            <w:ind w:leftChars="300" w:left="660"/>
+            <w:rPr>
+              <w:rFonts w:asciiTheme="minorHAnsi" w:hAnsiTheme="minorHAnsi" w:cstheme="minorBidi"/>
+              <w:noProof/>
+              <w:kern w:val="2"/>
+              <w:szCs w:val="24"/>
+              <w14:ligatures w14:val="standardContextual"/>
+            </w:rPr>
+          </w:pPr>
+          <w:hyperlink w:anchor="_Toc225106758" w:history="1">
+            <w:r>
+              <w:rPr>
+                <w:rStyle w:val="a5"/>
+                <w:rFonts w:eastAsia="Arial"/>
+                <w:noProof/>
+              </w:rPr>
+              <w:t>4.3 Miércoles 18 — Conversión a páginas estáticas</w:t>
+            </w:r>
+            <w:r>
+              <w:rPr>
+                <w:noProof/>
+                <w:webHidden/>
+              </w:rPr>
+              <w:tab/>
+            </w:r>
+            <w:r>
+              <w:rPr>
+                <w:noProof/>
+                <w:webHidden/>
+              </w:rPr>
+              <w:fldChar w:fldCharType="begin"/>
+            </w:r>
+            <w:r>
+              <w:rPr>
+                <w:noProof/>
+                <w:webHidden/>
+              </w:rPr>
+              <w:instrText xml:space="preserve"> PAGEREF _Toc225106758 \h </w:instrText>
+            </w:r>
+            <w:r>
+              <w:rPr>
+                <w:noProof/>
+                <w:webHidden/>
+              </w:rPr>
+            </w:r>
+            <w:r>
+              <w:rPr>
+                <w:noProof/>
+                <w:webHidden/>
+              </w:rPr>
+              <w:fldChar w:fldCharType="separate"/>
+            </w:r>
+            <w:r>
+              <w:rPr>
+                <w:noProof/>
+                <w:webHidden/>
+              </w:rPr>
+              <w:t>11</w:t>
+            </w:r>
+            <w:r>
+              <w:rPr>
+                <w:noProof/>
+                <w:webHidden/>
+              </w:rPr>
+              <w:fldChar w:fldCharType="end"/>
+            </w:r>
+          </w:hyperlink>
+        </w:p>
+        <w:p>
+          <w:pPr>
+            <w:pStyle w:val="TOC2"/>
+            <w:tabs>
+              <w:tab w:val="right" w:leader="dot" w:pos="9016"/>
+            </w:tabs>
+            <w:ind w:leftChars="300" w:left="660"/>
+            <w:rPr>
+              <w:rFonts w:asciiTheme="minorHAnsi" w:hAnsiTheme="minorHAnsi" w:cstheme="minorBidi"/>
+              <w:noProof/>
+              <w:kern w:val="2"/>
+              <w:szCs w:val="24"/>
+              <w14:ligatures w14:val="standardContextual"/>
+            </w:rPr>
+          </w:pPr>
+          <w:hyperlink w:anchor="_Toc225106759" w:history="1">
+            <w:r>
+              <w:rPr>
+                <w:rStyle w:val="a5"/>
+                <w:rFonts w:eastAsia="Arial"/>
+                <w:noProof/>
+              </w:rPr>
+              <w:t>4.4 Jueves 19 — Estética retro Steam 2002</w:t>
+            </w:r>
+            <w:r>
+              <w:rPr>
+                <w:noProof/>
+                <w:webHidden/>
+              </w:rPr>
+              <w:tab/>
+            </w:r>
+            <w:r>
+              <w:rPr>
+                <w:noProof/>
+                <w:webHidden/>
+              </w:rPr>
+              <w:fldChar w:fldCharType="begin"/>
+            </w:r>
+            <w:r>
+              <w:rPr>
+                <w:noProof/>
+                <w:webHidden/>
+              </w:rPr>
+              <w:instrText xml:space="preserve"> PAGEREF _Toc225106759 \h </w:instrText>
+            </w:r>
+            <w:r>
+              <w:rPr>
+                <w:noProof/>
+                <w:webHidden/>
+              </w:rPr>
+            </w:r>
+            <w:r>
+              <w:rPr>
+                <w:noProof/>
+                <w:webHidden/>
+              </w:rPr>
+              <w:fldChar w:fldCharType="separate"/>
+            </w:r>
+            <w:r>
+              <w:rPr>
+                <w:noProof/>
+                <w:webHidden/>
+              </w:rPr>
+              <w:t>12</w:t>
+            </w:r>
+            <w:r>
+              <w:rPr>
+                <w:noProof/>
+                <w:webHidden/>
+              </w:rPr>
+              <w:fldChar w:fldCharType="end"/>
+            </w:r>
+          </w:hyperlink>
+        </w:p>
+        <w:p>
+          <w:pPr>
+            <w:pStyle w:val="TOC2"/>
+            <w:tabs>
+              <w:tab w:val="right" w:leader="dot" w:pos="9016"/>
+            </w:tabs>
+            <w:ind w:leftChars="300" w:left="660"/>
+            <w:rPr>
+              <w:rFonts w:asciiTheme="minorHAnsi" w:hAnsiTheme="minorHAnsi" w:cstheme="minorBidi"/>
+              <w:noProof/>
+              <w:kern w:val="2"/>
+              <w:szCs w:val="24"/>
+              <w14:ligatures w14:val="standardContextual"/>
+            </w:rPr>
+          </w:pPr>
+          <w:hyperlink w:anchor="_Toc225106760" w:history="1">
+            <w:r>
+              <w:rPr>
+                <w:rStyle w:val="a5"/>
+                <w:rFonts w:eastAsia="Arial"/>
+                <w:noProof/>
+              </w:rPr>
+              <w:t>4.5 Viernes 20 — Simplificación del código</w:t>
+            </w:r>
+            <w:r>
+              <w:rPr>
+                <w:noProof/>
+                <w:webHidden/>
+              </w:rPr>
+              <w:tab/>
+            </w:r>
+            <w:r>
+              <w:rPr>
+                <w:noProof/>
+                <w:webHidden/>
+              </w:rPr>
+              <w:fldChar w:fldCharType="begin"/>
+            </w:r>
+            <w:r>
+              <w:rPr>
+                <w:noProof/>
+                <w:webHidden/>
+              </w:rPr>
+              <w:instrText xml:space="preserve"> PAGEREF _Toc225106760 \h </w:instrText>
+            </w:r>
+            <w:r>
+              <w:rPr>
+                <w:noProof/>
+                <w:webHidden/>
+              </w:rPr>
+            </w:r>
+            <w:r>
+              <w:rPr>
+                <w:noProof/>
+                <w:webHidden/>
+              </w:rPr>
+              <w:fldChar w:fldCharType="separate"/>
+            </w:r>
+            <w:r>
+              <w:rPr>
+                <w:noProof/>
+                <w:webHidden/>
+              </w:rPr>
+              <w:t>12</w:t>
+            </w:r>
+            <w:r>
+              <w:rPr>
+                <w:noProof/>
+                <w:webHidden/>
+              </w:rPr>
+              <w:fldChar w:fldCharType="end"/>
+            </w:r>
+          </w:hyperlink>
+        </w:p>
+        <w:p>
+          <w:pPr>
+            <w:pStyle w:val="TOC2"/>
+            <w:tabs>
+              <w:tab w:val="right" w:leader="dot" w:pos="9016"/>
+            </w:tabs>
+            <w:ind w:leftChars="300" w:left="660"/>
+            <w:rPr>
+              <w:rFonts w:asciiTheme="minorHAnsi" w:hAnsiTheme="minorHAnsi" w:cstheme="minorBidi"/>
+              <w:noProof/>
+              <w:kern w:val="2"/>
+              <w:szCs w:val="24"/>
+              <w14:ligatures w14:val="standardContextual"/>
+            </w:rPr>
+          </w:pPr>
+          <w:hyperlink w:anchor="_Toc225106761" w:history="1">
+            <w:r>
+              <w:rPr>
+                <w:rStyle w:val="a5"/>
+                <w:rFonts w:eastAsia="Arial"/>
+                <w:noProof/>
+              </w:rPr>
+              <w:t>4.6 Sábado 21 — Documentación</w:t>
+            </w:r>
+            <w:r>
+              <w:rPr>
+                <w:noProof/>
+                <w:webHidden/>
+              </w:rPr>
+              <w:tab/>
+            </w:r>
+            <w:r>
+              <w:rPr>
+                <w:noProof/>
+                <w:webHidden/>
+              </w:rPr>
+              <w:fldChar w:fldCharType="begin"/>
+            </w:r>
+            <w:r>
+              <w:rPr>
+                <w:noProof/>
+                <w:webHidden/>
+              </w:rPr>
+              <w:instrText xml:space="preserve"> PAGEREF _Toc225106761 \h </w:instrText>
+            </w:r>
+            <w:r>
+              <w:rPr>
+                <w:noProof/>
+                <w:webHidden/>
+              </w:rPr>
+            </w:r>
+            <w:r>
+              <w:rPr>
+                <w:noProof/>
+                <w:webHidden/>
+              </w:rPr>
+              <w:fldChar w:fldCharType="separate"/>
+            </w:r>
+            <w:r>
+              <w:rPr>
+                <w:noProof/>
+                <w:webHidden/>
+              </w:rPr>
+              <w:t>13</w:t>
+            </w:r>
+            <w:r>
+              <w:rPr>
+                <w:noProof/>
+                <w:webHidden/>
+              </w:rPr>
+              <w:fldChar w:fldCharType="end"/>
+            </w:r>
+          </w:hyperlink>
+        </w:p>
+        <w:p>
+          <w:pPr>
+            <w:pStyle w:val="TOC2"/>
+            <w:tabs>
+              <w:tab w:val="right" w:leader="dot" w:pos="9016"/>
+            </w:tabs>
+            <w:ind w:leftChars="300" w:left="660"/>
+            <w:rPr>
+              <w:rFonts w:asciiTheme="minorHAnsi" w:hAnsiTheme="minorHAnsi" w:cstheme="minorBidi"/>
+              <w:noProof/>
+              <w:kern w:val="2"/>
+              <w:szCs w:val="24"/>
+              <w14:ligatures w14:val="standardContextual"/>
+            </w:rPr>
+          </w:pPr>
+          <w:hyperlink w:anchor="_Toc225106762" w:history="1">
+            <w:r>
+              <w:rPr>
+                <w:rStyle w:val="a5"/>
+                <w:rFonts w:eastAsia="Arial"/>
+                <w:noProof/>
+              </w:rPr>
+              <w:t>4.7 Domingo 22 — Revisión final</w:t>
+            </w:r>
+            <w:r>
+              <w:rPr>
+                <w:noProof/>
+                <w:webHidden/>
+              </w:rPr>
+              <w:tab/>
+            </w:r>
+            <w:r>
+              <w:rPr>
+                <w:noProof/>
+                <w:webHidden/>
+              </w:rPr>
+              <w:fldChar w:fldCharType="begin"/>
+            </w:r>
+            <w:r>
+              <w:rPr>
+                <w:noProof/>
+                <w:webHidden/>
+              </w:rPr>
+              <w:instrText xml:space="preserve"> PAGEREF _Toc225106762 \h </w:instrText>
+            </w:r>
+            <w:r>
+              <w:rPr>
+                <w:noProof/>
+                <w:webHidden/>
+              </w:rPr>
+            </w:r>
+            <w:r>
+              <w:rPr>
+                <w:noProof/>
+                <w:webHidden/>
+              </w:rPr>
+              <w:fldChar w:fldCharType="separate"/>
+            </w:r>
+            <w:r>
+              <w:rPr>
+                <w:noProof/>
+                <w:webHidden/>
+              </w:rPr>
+              <w:t>13</w:t>
+            </w:r>
+            <w:r>
+              <w:rPr>
+                <w:noProof/>
+                <w:webHidden/>
+              </w:rPr>
+              <w:fldChar w:fldCharType="end"/>
+            </w:r>
+          </w:hyperlink>
+        </w:p>
+        <w:p>
+          <w:r>
+            <w:rPr>
+              <w:b/>
+              <w:bCs/>
+              <w:noProof/>
+            </w:rPr>
+            <w:fldChar w:fldCharType="end"/>
+          </w:r>
+        </w:p>
+      </w:sdtContent>
+    </w:sdt>
     <w:p>
       <w:pPr>
         <w:sectPr>
@@ -277,11 +2688,13 @@
         <w:pStyle w:val="1"/>
         <w:spacing w:after="120"/>
       </w:pPr>
+      <w:bookmarkStart w:id="0" w:name="_Toc225106731"/>
       <w:proofErr w:type="spellStart"/>
       <w:r>
         <w:lastRenderedPageBreak/>
         <w:t>Contenido</w:t>
       </w:r>
+      <w:bookmarkEnd w:id="0"/>
       <w:proofErr w:type="spellEnd"/>
     </w:p>
     <w:sdt>
@@ -289,7 +2702,6 @@
         <w:alias w:val="Tabla de contenidos"/>
         <w:id w:val="1767103585"/>
       </w:sdtPr>
-      <w:sdtEndPr/>
       <w:sdtContent>
         <w:p>
           <w:r>
@@ -520,21 +2932,7 @@
         <w:rPr>
           <w:rFonts w:eastAsia="Arial"/>
         </w:rPr>
-        <w:t xml:space="preserve">, login, </w:t>
-      </w:r>
-      <w:proofErr w:type="spellStart"/>
-      <w:r>
-        <w:rPr>
-          <w:rFonts w:eastAsia="Arial"/>
-        </w:rPr>
-        <w:t>registro</w:t>
-      </w:r>
-      <w:proofErr w:type="spellEnd"/>
-      <w:r>
-        <w:rPr>
-          <w:rFonts w:eastAsia="Arial"/>
-        </w:rPr>
-        <w:t xml:space="preserve">, </w:t>
+        <w:t xml:space="preserve">, login, registro, </w:t>
       </w:r>
       <w:proofErr w:type="spellStart"/>
       <w:r>
@@ -1285,6 +3683,7 @@
         <w:pStyle w:val="1"/>
         <w:spacing w:after="120"/>
       </w:pPr>
+      <w:bookmarkStart w:id="1" w:name="_Toc225106732"/>
       <w:r>
         <w:lastRenderedPageBreak/>
         <w:t xml:space="preserve">1. </w:t>
@@ -1293,6 +3692,7 @@
       <w:r>
         <w:t>Introducción</w:t>
       </w:r>
+      <w:bookmarkEnd w:id="1"/>
       <w:proofErr w:type="spellEnd"/>
     </w:p>
     <w:p>
@@ -1988,21 +4388,7 @@
         <w:rPr>
           <w:rFonts w:eastAsia="Arial"/>
         </w:rPr>
-        <w:t xml:space="preserve"> y </w:t>
-      </w:r>
-      <w:proofErr w:type="spellStart"/>
-      <w:r>
-        <w:rPr>
-          <w:rFonts w:eastAsia="Arial"/>
-        </w:rPr>
-        <w:t>registro</w:t>
-      </w:r>
-      <w:proofErr w:type="spellEnd"/>
-      <w:r>
-        <w:rPr>
-          <w:rFonts w:eastAsia="Arial"/>
-        </w:rPr>
-        <w:t xml:space="preserve"> de </w:t>
+        <w:t xml:space="preserve"> y registro de </w:t>
       </w:r>
       <w:proofErr w:type="spellStart"/>
       <w:r>
@@ -2029,6 +4415,7 @@
         <w:pStyle w:val="1"/>
         <w:spacing w:after="120"/>
       </w:pPr>
+      <w:bookmarkStart w:id="2" w:name="_Toc225106733"/>
       <w:r>
         <w:lastRenderedPageBreak/>
         <w:t xml:space="preserve">2. </w:t>
@@ -2045,6 +4432,7 @@
       <w:r>
         <w:t>Proyecto</w:t>
       </w:r>
+      <w:bookmarkEnd w:id="2"/>
       <w:proofErr w:type="spellEnd"/>
     </w:p>
     <w:p>
@@ -2372,6 +4760,7 @@
         <w:pStyle w:val="2"/>
         <w:spacing w:before="240" w:after="120"/>
       </w:pPr>
+      <w:bookmarkStart w:id="3" w:name="_Toc225106734"/>
       <w:r>
         <w:t xml:space="preserve">2.1 </w:t>
       </w:r>
@@ -2387,6 +4776,7 @@
       <w:r>
         <w:t>proyecto</w:t>
       </w:r>
+      <w:bookmarkEnd w:id="3"/>
       <w:proofErr w:type="spellEnd"/>
     </w:p>
     <w:p>
@@ -3115,27 +5505,7 @@
                 <w:sz w:val="20"/>
                 <w:szCs w:val="20"/>
               </w:rPr>
-              <w:t xml:space="preserve"> de </w:t>
-            </w:r>
-            <w:proofErr w:type="spellStart"/>
-            <w:r>
-              <w:rPr>
-                <w:rFonts w:eastAsia="Arial"/>
-                <w:color w:val="000000"/>
-                <w:sz w:val="20"/>
-                <w:szCs w:val="20"/>
-              </w:rPr>
-              <w:t>registro</w:t>
-            </w:r>
-            <w:proofErr w:type="spellEnd"/>
-            <w:r>
-              <w:rPr>
-                <w:rFonts w:eastAsia="Arial"/>
-                <w:color w:val="000000"/>
-                <w:sz w:val="20"/>
-                <w:szCs w:val="20"/>
-              </w:rPr>
-              <w:t xml:space="preserve"> de nueva </w:t>
+              <w:t xml:space="preserve"> de registro de nueva </w:t>
             </w:r>
             <w:proofErr w:type="spellStart"/>
             <w:r>
@@ -4738,19 +7108,8 @@
                 <w:sz w:val="20"/>
                 <w:szCs w:val="20"/>
               </w:rPr>
-              <w:t xml:space="preserve"> de </w:t>
-            </w:r>
-            <w:proofErr w:type="spellStart"/>
-            <w:r>
-              <w:rPr>
-                <w:rFonts w:eastAsia="Arial"/>
-                <w:color w:val="000000"/>
-                <w:sz w:val="20"/>
-                <w:szCs w:val="20"/>
-              </w:rPr>
-              <w:t>registro</w:t>
-            </w:r>
-            <w:proofErr w:type="spellEnd"/>
+              <w:t xml:space="preserve"> de registro</w:t>
+            </w:r>
           </w:p>
         </w:tc>
       </w:tr>
@@ -4765,6 +7124,7 @@
         <w:pStyle w:val="2"/>
         <w:spacing w:before="240" w:after="120"/>
       </w:pPr>
+      <w:bookmarkStart w:id="4" w:name="_Toc225106735"/>
       <w:r>
         <w:t xml:space="preserve">2.2 </w:t>
       </w:r>
@@ -4776,6 +7136,7 @@
       <w:r>
         <w:t xml:space="preserve"> HTML</w:t>
       </w:r>
+      <w:bookmarkEnd w:id="4"/>
     </w:p>
     <w:p>
       <w:pPr>
@@ -5227,6 +7588,7 @@
         <w:pStyle w:val="1"/>
         <w:spacing w:after="120"/>
       </w:pPr>
+      <w:bookmarkStart w:id="5" w:name="_Toc225106736"/>
       <w:r>
         <w:lastRenderedPageBreak/>
         <w:t xml:space="preserve">3. </w:t>
@@ -5243,6 +7605,7 @@
       <w:r>
         <w:t>Datos</w:t>
       </w:r>
+      <w:bookmarkEnd w:id="5"/>
       <w:proofErr w:type="spellEnd"/>
     </w:p>
     <w:p>
@@ -5250,6 +7613,7 @@
         <w:pStyle w:val="2"/>
         <w:spacing w:before="240" w:after="120"/>
       </w:pPr>
+      <w:bookmarkStart w:id="6" w:name="_Toc225106737"/>
       <w:r>
         <w:t xml:space="preserve">3.1 </w:t>
       </w:r>
@@ -5261,6 +7625,7 @@
       <w:r>
         <w:t xml:space="preserve"> JSON (games.json)</w:t>
       </w:r>
+      <w:bookmarkEnd w:id="6"/>
     </w:p>
     <w:p>
       <w:pPr>
@@ -6219,6 +8584,7 @@
         <w:pStyle w:val="2"/>
         <w:spacing w:before="240" w:after="120"/>
       </w:pPr>
+      <w:bookmarkStart w:id="7" w:name="_Toc225106738"/>
       <w:r>
         <w:t xml:space="preserve">3.2 </w:t>
       </w:r>
@@ -6230,6 +8596,7 @@
       <w:r>
         <w:t xml:space="preserve"> YAML (config.yaml)</w:t>
       </w:r>
+      <w:bookmarkEnd w:id="7"/>
     </w:p>
     <w:p>
       <w:pPr>
@@ -7045,6 +9412,7 @@
         <w:pStyle w:val="1"/>
         <w:spacing w:after="120"/>
       </w:pPr>
+      <w:bookmarkStart w:id="8" w:name="_Toc225106739"/>
       <w:r>
         <w:lastRenderedPageBreak/>
         <w:t xml:space="preserve">4. </w:t>
@@ -7057,12 +9425,14 @@
       <w:r>
         <w:t xml:space="preserve"> con Bootstrap</w:t>
       </w:r>
+      <w:bookmarkEnd w:id="8"/>
     </w:p>
     <w:p>
       <w:pPr>
         <w:pStyle w:val="2"/>
         <w:spacing w:before="240" w:after="120"/>
       </w:pPr>
+      <w:bookmarkStart w:id="9" w:name="_Toc225106740"/>
       <w:r>
         <w:t xml:space="preserve">4.1 </w:t>
       </w:r>
@@ -7074,6 +9444,7 @@
       <w:r>
         <w:t xml:space="preserve"> de Bootstrap 5</w:t>
       </w:r>
+      <w:bookmarkEnd w:id="9"/>
     </w:p>
     <w:p>
       <w:pPr>
@@ -7858,6 +10229,7 @@
         <w:pStyle w:val="2"/>
         <w:spacing w:before="240" w:after="120"/>
       </w:pPr>
+      <w:bookmarkStart w:id="10" w:name="_Toc225106741"/>
       <w:r>
         <w:t xml:space="preserve">4.2 </w:t>
       </w:r>
@@ -7869,6 +10241,7 @@
       <w:r>
         <w:t xml:space="preserve"> retro Steam 2002</w:t>
       </w:r>
+      <w:bookmarkEnd w:id="10"/>
     </w:p>
     <w:p>
       <w:pPr>
@@ -8207,21 +10580,7 @@
         <w:rPr>
           <w:rFonts w:eastAsia="Arial"/>
         </w:rPr>
-        <w:t xml:space="preserve"> Verdana a 12px: la </w:t>
-      </w:r>
-      <w:proofErr w:type="spellStart"/>
-      <w:r>
-        <w:rPr>
-          <w:rFonts w:eastAsia="Arial"/>
-        </w:rPr>
-        <w:t>fuente</w:t>
-      </w:r>
-      <w:proofErr w:type="spellEnd"/>
-      <w:r>
-        <w:rPr>
-          <w:rFonts w:eastAsia="Arial"/>
-        </w:rPr>
-        <w:t xml:space="preserve"> </w:t>
+        <w:t xml:space="preserve"> Verdana a 12px: la fuente </w:t>
       </w:r>
       <w:proofErr w:type="spellStart"/>
       <w:r>
@@ -8664,6 +11023,7 @@
         <w:pStyle w:val="1"/>
         <w:spacing w:after="120"/>
       </w:pPr>
+      <w:bookmarkStart w:id="11" w:name="_Toc225106742"/>
       <w:r>
         <w:lastRenderedPageBreak/>
         <w:t xml:space="preserve">5. </w:t>
@@ -8672,6 +11032,7 @@
       <w:r>
         <w:t>Interactividad</w:t>
       </w:r>
+      <w:bookmarkEnd w:id="11"/>
       <w:proofErr w:type="spellEnd"/>
     </w:p>
     <w:p>
@@ -8679,6 +11040,7 @@
         <w:pStyle w:val="2"/>
         <w:spacing w:before="240" w:after="120"/>
       </w:pPr>
+      <w:bookmarkStart w:id="12" w:name="_Toc225106743"/>
       <w:r>
         <w:t xml:space="preserve">5.1 </w:t>
       </w:r>
@@ -8702,6 +11064,7 @@
       <w:r>
         <w:t>categoría</w:t>
       </w:r>
+      <w:bookmarkEnd w:id="12"/>
       <w:proofErr w:type="spellEnd"/>
     </w:p>
     <w:p>
@@ -9113,6 +11476,7 @@
         <w:pStyle w:val="2"/>
         <w:spacing w:before="240" w:after="120"/>
       </w:pPr>
+      <w:bookmarkStart w:id="13" w:name="_Toc225106744"/>
       <w:r>
         <w:t xml:space="preserve">5.2 Vista cards y </w:t>
       </w:r>
@@ -9120,6 +11484,7 @@
       <w:r>
         <w:t>lista</w:t>
       </w:r>
+      <w:bookmarkEnd w:id="13"/>
       <w:proofErr w:type="spellEnd"/>
     </w:p>
     <w:p>
@@ -9377,6 +11742,7 @@
         <w:pStyle w:val="2"/>
         <w:spacing w:before="240" w:after="120"/>
       </w:pPr>
+      <w:bookmarkStart w:id="14" w:name="_Toc225106745"/>
       <w:r>
         <w:t xml:space="preserve">5.3 </w:t>
       </w:r>
@@ -9384,6 +11750,7 @@
       <w:r>
         <w:t>Paginación</w:t>
       </w:r>
+      <w:bookmarkEnd w:id="14"/>
       <w:proofErr w:type="spellEnd"/>
     </w:p>
     <w:p>
@@ -9753,6 +12120,7 @@
         <w:pStyle w:val="2"/>
         <w:spacing w:before="240" w:after="120"/>
       </w:pPr>
+      <w:bookmarkStart w:id="15" w:name="_Toc225106746"/>
       <w:r>
         <w:t xml:space="preserve">5.4 </w:t>
       </w:r>
@@ -9772,6 +12140,7 @@
       <w:r>
         <w:t xml:space="preserve"> YAML</w:t>
       </w:r>
+      <w:bookmarkEnd w:id="15"/>
     </w:p>
     <w:p>
       <w:pPr>
@@ -10366,6 +12735,7 @@
         <w:pStyle w:val="2"/>
         <w:spacing w:before="240" w:after="120"/>
       </w:pPr>
+      <w:bookmarkStart w:id="16" w:name="_Toc225106747"/>
       <w:r>
         <w:t xml:space="preserve">5.5 </w:t>
       </w:r>
@@ -10385,6 +12755,7 @@
       <w:r>
         <w:t xml:space="preserve"> y claro</w:t>
       </w:r>
+      <w:bookmarkEnd w:id="16"/>
     </w:p>
     <w:p>
       <w:pPr>
@@ -10683,6 +13054,7 @@
         <w:pStyle w:val="2"/>
         <w:spacing w:before="240" w:after="120"/>
       </w:pPr>
+      <w:bookmarkStart w:id="17" w:name="_Toc225106748"/>
       <w:r>
         <w:t xml:space="preserve">5.6 </w:t>
       </w:r>
@@ -10698,6 +13070,7 @@
       <w:r>
         <w:t>idioma</w:t>
       </w:r>
+      <w:bookmarkEnd w:id="17"/>
       <w:proofErr w:type="spellEnd"/>
     </w:p>
     <w:p>
@@ -11081,6 +13454,7 @@
         <w:pStyle w:val="2"/>
         <w:spacing w:before="240" w:after="120"/>
       </w:pPr>
+      <w:bookmarkStart w:id="18" w:name="_Toc225106749"/>
       <w:r>
         <w:t xml:space="preserve">5.7 </w:t>
       </w:r>
@@ -11092,6 +13466,7 @@
       <w:r>
         <w:t xml:space="preserve"> con localStorage</w:t>
       </w:r>
+      <w:bookmarkEnd w:id="18"/>
     </w:p>
     <w:p>
       <w:pPr>
@@ -11516,14 +13891,11 @@
         <w:pStyle w:val="2"/>
         <w:spacing w:before="240" w:after="120"/>
       </w:pPr>
-      <w:r>
-        <w:t xml:space="preserve">5.8 Login y </w:t>
-      </w:r>
-      <w:proofErr w:type="spellStart"/>
-      <w:r>
-        <w:t>registro</w:t>
-      </w:r>
-      <w:proofErr w:type="spellEnd"/>
+      <w:bookmarkStart w:id="19" w:name="_Toc225106750"/>
+      <w:r>
+        <w:t>5.8 Login y registro</w:t>
+      </w:r>
+      <w:bookmarkEnd w:id="19"/>
     </w:p>
     <w:p>
       <w:pPr>
@@ -11576,21 +13948,7 @@
         <w:rPr>
           <w:rFonts w:eastAsia="Arial"/>
         </w:rPr>
-        <w:t xml:space="preserve"> y </w:t>
-      </w:r>
-      <w:proofErr w:type="spellStart"/>
-      <w:r>
-        <w:rPr>
-          <w:rFonts w:eastAsia="Arial"/>
-        </w:rPr>
-        <w:t>registro</w:t>
-      </w:r>
-      <w:proofErr w:type="spellEnd"/>
-      <w:r>
-        <w:rPr>
-          <w:rFonts w:eastAsia="Arial"/>
-        </w:rPr>
-        <w:t xml:space="preserve"> </w:t>
+        <w:t xml:space="preserve"> y registro </w:t>
       </w:r>
       <w:proofErr w:type="spellStart"/>
       <w:r>
@@ -11902,6 +14260,7 @@
         <w:pStyle w:val="1"/>
         <w:spacing w:after="120"/>
       </w:pPr>
+      <w:bookmarkStart w:id="20" w:name="_Toc225106751"/>
       <w:r>
         <w:lastRenderedPageBreak/>
         <w:t>7</w:t>
@@ -11913,6 +14272,7 @@
       <w:r>
         <w:t>Memoria</w:t>
       </w:r>
+      <w:bookmarkEnd w:id="20"/>
       <w:proofErr w:type="spellEnd"/>
     </w:p>
     <w:p>
@@ -11928,6 +14288,7 @@
           <w:szCs w:val="26"/>
         </w:rPr>
       </w:pPr>
+      <w:bookmarkStart w:id="21" w:name="_Toc225106752"/>
       <w:r>
         <w:rPr>
           <w:rFonts w:eastAsia="Arial"/>
@@ -11971,6 +14332,7 @@
         </w:rPr>
         <w:t>tema</w:t>
       </w:r>
+      <w:bookmarkEnd w:id="21"/>
       <w:proofErr w:type="spellEnd"/>
     </w:p>
     <w:p>
@@ -12820,21 +15182,7 @@
         <w:rPr>
           <w:rFonts w:eastAsia="Arial"/>
         </w:rPr>
-        <w:t xml:space="preserve">, login, </w:t>
-      </w:r>
-      <w:proofErr w:type="spellStart"/>
-      <w:r>
-        <w:rPr>
-          <w:rFonts w:eastAsia="Arial"/>
-        </w:rPr>
-        <w:t>registro</w:t>
-      </w:r>
-      <w:proofErr w:type="spellEnd"/>
-      <w:r>
-        <w:rPr>
-          <w:rFonts w:eastAsia="Arial"/>
-        </w:rPr>
-        <w:t xml:space="preserve">) </w:t>
+        <w:t xml:space="preserve">, login, registro) </w:t>
       </w:r>
       <w:proofErr w:type="spellStart"/>
       <w:r>
@@ -12906,6 +15254,7 @@
           <w:szCs w:val="26"/>
         </w:rPr>
       </w:pPr>
+      <w:bookmarkStart w:id="22" w:name="_Toc225106753"/>
       <w:r>
         <w:rPr>
           <w:rFonts w:eastAsia="Arial"/>
@@ -12938,6 +15287,7 @@
         </w:rPr>
         <w:t xml:space="preserve"> de roles</w:t>
       </w:r>
+      <w:bookmarkEnd w:id="22"/>
     </w:p>
     <w:p>
       <w:pPr>
@@ -13617,25 +15967,7 @@
                 <w:sz w:val="20"/>
                 <w:szCs w:val="20"/>
               </w:rPr>
-              <w:t xml:space="preserve">, login, </w:t>
-            </w:r>
-            <w:proofErr w:type="spellStart"/>
-            <w:r>
-              <w:rPr>
-                <w:rFonts w:eastAsia="Arial"/>
-                <w:sz w:val="20"/>
-                <w:szCs w:val="20"/>
-              </w:rPr>
-              <w:t>registro</w:t>
-            </w:r>
-            <w:proofErr w:type="spellEnd"/>
-            <w:r>
-              <w:rPr>
-                <w:rFonts w:eastAsia="Arial"/>
-                <w:sz w:val="20"/>
-                <w:szCs w:val="20"/>
-              </w:rPr>
-              <w:t>).</w:t>
+              <w:t>, login, registro).</w:t>
             </w:r>
           </w:p>
           <w:p>
@@ -14166,25 +16498,7 @@
                 <w:sz w:val="20"/>
                 <w:szCs w:val="20"/>
               </w:rPr>
-              <w:t xml:space="preserve"> de login y </w:t>
-            </w:r>
-            <w:proofErr w:type="spellStart"/>
-            <w:r>
-              <w:rPr>
-                <w:rFonts w:eastAsia="Arial"/>
-                <w:sz w:val="20"/>
-                <w:szCs w:val="20"/>
-              </w:rPr>
-              <w:t>registro</w:t>
-            </w:r>
-            <w:proofErr w:type="spellEnd"/>
-            <w:r>
-              <w:rPr>
-                <w:rFonts w:eastAsia="Arial"/>
-                <w:sz w:val="20"/>
-                <w:szCs w:val="20"/>
-              </w:rPr>
-              <w:t>.</w:t>
+              <w:t xml:space="preserve"> de login y registro.</w:t>
             </w:r>
           </w:p>
           <w:p>
@@ -14416,6 +16730,7 @@
           <w:szCs w:val="26"/>
         </w:rPr>
       </w:pPr>
+      <w:bookmarkStart w:id="23" w:name="_Toc225106754"/>
       <w:r>
         <w:rPr>
           <w:rFonts w:eastAsia="Arial"/>
@@ -14459,6 +16774,7 @@
         </w:rPr>
         <w:t>semanal</w:t>
       </w:r>
+      <w:bookmarkEnd w:id="23"/>
       <w:proofErr w:type="spellEnd"/>
     </w:p>
     <w:p>
@@ -14692,22 +17008,23 @@
       <w:pPr>
         <w:widowControl/>
         <w:spacing w:before="280" w:after="140"/>
-        <w:outlineLvl w:val="0"/>
+        <w:outlineLvl w:val="1"/>
         <w:rPr>
           <w:rFonts w:eastAsia="Arial"/>
           <w:b/>
           <w:bCs/>
-          <w:sz w:val="30"/>
-          <w:szCs w:val="30"/>
+          <w:sz w:val="26"/>
+          <w:szCs w:val="26"/>
         </w:rPr>
       </w:pPr>
+      <w:bookmarkStart w:id="24" w:name="_Toc225106755"/>
       <w:r>
         <w:rPr>
           <w:rFonts w:eastAsia="Arial"/>
           <w:b/>
           <w:bCs/>
-          <w:sz w:val="30"/>
-          <w:szCs w:val="30"/>
+          <w:sz w:val="26"/>
+          <w:szCs w:val="26"/>
         </w:rPr>
         <w:lastRenderedPageBreak/>
         <w:t>4</w:t>
@@ -14717,8 +17034,8 @@
           <w:rFonts w:eastAsia="Arial"/>
           <w:b/>
           <w:bCs/>
-          <w:sz w:val="30"/>
-          <w:szCs w:val="30"/>
+          <w:sz w:val="26"/>
+          <w:szCs w:val="26"/>
         </w:rPr>
         <w:t xml:space="preserve">. </w:t>
       </w:r>
@@ -14728,8 +17045,8 @@
           <w:rFonts w:eastAsia="Arial"/>
           <w:b/>
           <w:bCs/>
-          <w:sz w:val="30"/>
-          <w:szCs w:val="30"/>
+          <w:sz w:val="26"/>
+          <w:szCs w:val="26"/>
         </w:rPr>
         <w:t>Desarrollo</w:t>
       </w:r>
@@ -14739,8 +17056,8 @@
           <w:rFonts w:eastAsia="Arial"/>
           <w:b/>
           <w:bCs/>
-          <w:sz w:val="30"/>
-          <w:szCs w:val="30"/>
+          <w:sz w:val="26"/>
+          <w:szCs w:val="26"/>
         </w:rPr>
         <w:t xml:space="preserve"> </w:t>
       </w:r>
@@ -14750,8 +17067,8 @@
           <w:rFonts w:eastAsia="Arial"/>
           <w:b/>
           <w:bCs/>
-          <w:sz w:val="30"/>
-          <w:szCs w:val="30"/>
+          <w:sz w:val="26"/>
+          <w:szCs w:val="26"/>
         </w:rPr>
         <w:t>día</w:t>
       </w:r>
@@ -14761,8 +17078,8 @@
           <w:rFonts w:eastAsia="Arial"/>
           <w:b/>
           <w:bCs/>
-          <w:sz w:val="30"/>
-          <w:szCs w:val="30"/>
+          <w:sz w:val="26"/>
+          <w:szCs w:val="26"/>
         </w:rPr>
         <w:t xml:space="preserve"> a </w:t>
       </w:r>
@@ -14772,11 +17089,12 @@
           <w:rFonts w:eastAsia="Arial"/>
           <w:b/>
           <w:bCs/>
-          <w:sz w:val="30"/>
-          <w:szCs w:val="30"/>
+          <w:sz w:val="26"/>
+          <w:szCs w:val="26"/>
         </w:rPr>
         <w:t>día</w:t>
       </w:r>
+      <w:bookmarkEnd w:id="24"/>
       <w:proofErr w:type="spellEnd"/>
     </w:p>
     <w:p>
@@ -14792,6 +17110,7 @@
           <w:szCs w:val="26"/>
         </w:rPr>
       </w:pPr>
+      <w:bookmarkStart w:id="25" w:name="_Toc225106756"/>
       <w:r>
         <w:rPr>
           <w:rFonts w:eastAsia="Arial"/>
@@ -14845,6 +17164,7 @@
         </w:rPr>
         <w:t>datos</w:t>
       </w:r>
+      <w:bookmarkEnd w:id="25"/>
       <w:proofErr w:type="spellEnd"/>
     </w:p>
     <w:p>
@@ -15910,6 +18230,7 @@
           <w:szCs w:val="26"/>
         </w:rPr>
       </w:pPr>
+      <w:bookmarkStart w:id="26" w:name="_Toc225106757"/>
       <w:r>
         <w:rPr>
           <w:rFonts w:eastAsia="Arial"/>
@@ -15996,6 +18317,7 @@
         </w:rPr>
         <w:t xml:space="preserve"> SPA</w:t>
       </w:r>
+      <w:bookmarkEnd w:id="26"/>
     </w:p>
     <w:p>
       <w:pPr>
@@ -16174,21 +18496,7 @@
         <w:rPr>
           <w:rFonts w:eastAsia="Arial"/>
         </w:rPr>
-        <w:t>, #login, #</w:t>
-      </w:r>
-      <w:proofErr w:type="spellStart"/>
-      <w:r>
-        <w:rPr>
-          <w:rFonts w:eastAsia="Arial"/>
-        </w:rPr>
-        <w:t>registro</w:t>
-      </w:r>
-      <w:proofErr w:type="spellEnd"/>
-      <w:r>
-        <w:rPr>
-          <w:rFonts w:eastAsia="Arial"/>
-        </w:rPr>
-        <w:t xml:space="preserve">). Se </w:t>
+        <w:t xml:space="preserve">, #login, #registro). Se </w:t>
       </w:r>
       <w:proofErr w:type="spellStart"/>
       <w:r>
@@ -16858,6 +19166,7 @@
           <w:szCs w:val="26"/>
         </w:rPr>
       </w:pPr>
+      <w:bookmarkStart w:id="27" w:name="_Toc225106758"/>
       <w:r>
         <w:rPr>
           <w:rFonts w:eastAsia="Arial"/>
@@ -16955,6 +19264,7 @@
         </w:rPr>
         <w:t>estáticas</w:t>
       </w:r>
+      <w:bookmarkEnd w:id="27"/>
       <w:proofErr w:type="spellEnd"/>
     </w:p>
     <w:p>
@@ -18489,6 +20799,7 @@
           <w:szCs w:val="26"/>
         </w:rPr>
       </w:pPr>
+      <w:bookmarkStart w:id="28" w:name="_Toc225106759"/>
       <w:r>
         <w:rPr>
           <w:rFonts w:eastAsia="Arial"/>
@@ -18553,6 +20864,7 @@
         </w:rPr>
         <w:t xml:space="preserve"> retro Steam 2002</w:t>
       </w:r>
+      <w:bookmarkEnd w:id="28"/>
     </w:p>
     <w:p>
       <w:pPr>
@@ -19689,6 +22001,7 @@
           <w:szCs w:val="26"/>
         </w:rPr>
       </w:pPr>
+      <w:bookmarkStart w:id="29" w:name="_Toc225106760"/>
       <w:r>
         <w:rPr>
           <w:rFonts w:eastAsia="Arial"/>
@@ -19764,6 +22077,7 @@
         </w:rPr>
         <w:t>código</w:t>
       </w:r>
+      <w:bookmarkEnd w:id="29"/>
       <w:proofErr w:type="spellEnd"/>
     </w:p>
     <w:p>
@@ -20832,21 +23146,7 @@
         <w:rPr>
           <w:rFonts w:eastAsia="Arial"/>
         </w:rPr>
-        <w:t xml:space="preserve">). Los scripts de login y </w:t>
-      </w:r>
-      <w:proofErr w:type="spellStart"/>
-      <w:r>
-        <w:rPr>
-          <w:rFonts w:eastAsia="Arial"/>
-        </w:rPr>
-        <w:t>registro</w:t>
-      </w:r>
-      <w:proofErr w:type="spellEnd"/>
-      <w:r>
-        <w:rPr>
-          <w:rFonts w:eastAsia="Arial"/>
-        </w:rPr>
-        <w:t xml:space="preserve"> solo </w:t>
+        <w:t xml:space="preserve">). Los scripts de login y registro solo </w:t>
       </w:r>
       <w:proofErr w:type="spellStart"/>
       <w:r>
@@ -21148,6 +23448,7 @@
           <w:szCs w:val="26"/>
         </w:rPr>
       </w:pPr>
+      <w:bookmarkStart w:id="30" w:name="_Toc225106761"/>
       <w:r>
         <w:rPr>
           <w:rFonts w:eastAsia="Arial"/>
@@ -21201,6 +23502,7 @@
         </w:rPr>
         <w:t>Documentación</w:t>
       </w:r>
+      <w:bookmarkEnd w:id="30"/>
       <w:proofErr w:type="spellEnd"/>
     </w:p>
     <w:p>
@@ -21592,6 +23894,7 @@
           <w:szCs w:val="26"/>
         </w:rPr>
       </w:pPr>
+      <w:bookmarkStart w:id="31" w:name="_Toc225106762"/>
       <w:r>
         <w:rPr>
           <w:rFonts w:eastAsia="Arial"/>
@@ -21634,6 +23937,7 @@
         </w:rPr>
         <w:t xml:space="preserve"> final</w:t>
       </w:r>
+      <w:bookmarkEnd w:id="31"/>
     </w:p>
     <w:p>
       <w:pPr>
@@ -22976,6 +25280,49 @@
       <w:szCs w:val="18"/>
     </w:rPr>
   </w:style>
+  <w:style w:type="paragraph" w:styleId="TOC">
+    <w:name w:val="TOC Heading"/>
+    <w:basedOn w:val="1"/>
+    <w:next w:val="a"/>
+    <w:uiPriority w:val="39"/>
+    <w:unhideWhenUsed/>
+    <w:qFormat/>
+    <w:rsid w:val="00A61FB7"/>
+    <w:pPr>
+      <w:keepNext/>
+      <w:keepLines/>
+      <w:spacing w:before="480" w:after="0" w:line="276" w:lineRule="auto"/>
+      <w:outlineLvl w:val="9"/>
+    </w:pPr>
+    <w:rPr>
+      <w:rFonts w:asciiTheme="majorHAnsi" w:eastAsiaTheme="majorEastAsia" w:hAnsiTheme="majorHAnsi" w:cstheme="majorBidi"/>
+      <w:color w:val="0F4761" w:themeColor="accent1" w:themeShade="BF"/>
+      <w:sz w:val="28"/>
+      <w:szCs w:val="28"/>
+      <w:lang w:eastAsia="en-US"/>
+    </w:rPr>
+  </w:style>
+  <w:style w:type="paragraph" w:styleId="TOC1">
+    <w:name w:val="toc 1"/>
+    <w:basedOn w:val="a"/>
+    <w:next w:val="a"/>
+    <w:autoRedefine/>
+    <w:uiPriority w:val="39"/>
+    <w:unhideWhenUsed/>
+    <w:rsid w:val="00A61FB7"/>
+  </w:style>
+  <w:style w:type="paragraph" w:styleId="TOC2">
+    <w:name w:val="toc 2"/>
+    <w:basedOn w:val="a"/>
+    <w:next w:val="a"/>
+    <w:autoRedefine/>
+    <w:uiPriority w:val="39"/>
+    <w:unhideWhenUsed/>
+    <w:rsid w:val="00A61FB7"/>
+    <w:pPr>
+      <w:ind w:leftChars="200" w:left="420"/>
+    </w:pPr>
+  </w:style>
 </w:styles>
 </file>
 

</xml_diff>